<commit_message>
Support Stage2 open-to endpoint inference
</commit_message>
<xml_diff>
--- a/soc_sdc_work/Flatten SDC脚本/STA Flatten 2 Set Delay Merge PrimeTime脚本/Stage 2 Integration E2E Delay Merge Proc 规则.docx
+++ b/soc_sdc_work/Flatten SDC脚本/STA Flatten 2 Set Delay Merge PrimeTime脚本/Stage 2 Integration E2E Delay Merge Proc 规则.docx
@@ -8,25 +8,7 @@
         <w:pStyle w:val="Heading1"/>
       </w:pPr>
       <w:r>
-        <w:t xml:space="preserve">Stage </w:t>
-      </w:r>
-      <w:r>
-        <w:rPr>
-          <w:rFonts w:hint="eastAsia"/>
-        </w:rPr>
-        <w:t xml:space="preserve">2：Integration</w:t>
-      </w:r>
-      <w:r>
-        <w:t xml:space="preserve"> E2E Delay Merge Proc </w:t>
-      </w:r>
-      <w:r>
-        <w:rPr>
-          <w:rFonts w:hint="eastAsia"/>
-        </w:rPr>
-        <w:t xml:space="preserve">规则</w:t>
-      </w:r>
-      <w:r>
-        <w:t xml:space="preserve"> v0.3</w:t>
+        <w:t>Stage 2：Integration E2E Delay Merge Proc 规则 v0.4</w:t>
       </w:r>
     </w:p>
     <w:bookmarkStart w:id="9" w:name="修订记录v0.2-v0.3"/>
@@ -35,19 +17,7 @@
         <w:pStyle w:val="Heading2"/>
       </w:pPr>
       <w:r>
-        <w:rPr>
-          <w:rFonts w:hint="eastAsia"/>
-        </w:rPr>
-        <w:t xml:space="preserve">修订记录（v0.2</w:t>
-      </w:r>
-      <w:r>
-        <w:t xml:space="preserve"> → </w:t>
-      </w:r>
-      <w:r>
-        <w:rPr>
-          <w:rFonts w:hint="eastAsia"/>
-        </w:rPr>
-        <w:t xml:space="preserve">v0.3）</w:t>
+        <w:t>修订记录（v0.3 → v0.4）</w:t>
       </w:r>
     </w:p>
     <w:p>
@@ -55,19 +25,7 @@
         <w:pStyle w:val="FirstParagraph"/>
       </w:pPr>
       <w:r>
-        <w:rPr>
-          <w:rFonts w:hint="eastAsia"/>
-        </w:rPr>
-        <w:t xml:space="preserve">基于</w:t>
-      </w:r>
-      <w:r>
-        <w:t xml:space="preserve"> v0.2 </w:t>
-      </w:r>
-      <w:r>
-        <w:rPr>
-          <w:rFonts w:hint="eastAsia"/>
-        </w:rPr>
-        <w:t xml:space="preserve">评审结论修订：</w:t>
+        <w:t>基于 v0.9.0 实现补充 open_to、递归链和覆盖完整性规则：</w:t>
       </w:r>
     </w:p>
     <w:p>
@@ -75,414 +33,19 @@
         <w:pStyle w:val="SourceCode"/>
       </w:pPr>
       <w:r>
-        <w:rPr>
-          <w:rStyle w:val="VerbatimChar"/>
-        </w:rPr>
-        <w:t xml:space="preserve">1. </w:t>
-      </w:r>
-      <w:r>
-        <w:rPr>
-          <w:rStyle w:val="VerbatimChar"/>
-          <w:rFonts w:hint="eastAsia"/>
-        </w:rPr>
-        <w:t xml:space="preserve">统一术语：缺</w:t>
-      </w:r>
-      <w:r>
-        <w:rPr>
-          <w:rStyle w:val="VerbatimChar"/>
-        </w:rPr>
-        <w:t xml:space="preserve"> -from </w:t>
-      </w:r>
-      <w:r>
-        <w:rPr>
-          <w:rStyle w:val="VerbatimChar"/>
-          <w:rFonts w:hint="eastAsia"/>
-        </w:rPr>
-        <w:t xml:space="preserve">的</w:t>
-      </w:r>
-      <w:r>
-        <w:rPr>
-          <w:rStyle w:val="VerbatimChar"/>
-        </w:rPr>
-        <w:t xml:space="preserve"> delay </w:t>
-      </w:r>
-      <w:r>
-        <w:rPr>
-          <w:rStyle w:val="VerbatimChar"/>
-          <w:rFonts w:hint="eastAsia"/>
-        </w:rPr>
-        <w:t xml:space="preserve">约束一律称为</w:t>
-      </w:r>
-      <w:r>
-        <w:rPr>
-          <w:rStyle w:val="VerbatimChar"/>
-        </w:rPr>
-        <w:t xml:space="preserve"> </w:t>
-      </w:r>
-      <w:r>
-        <w:rPr>
-          <w:rStyle w:val="VerbatimChar"/>
-          <w:rFonts w:hint="eastAsia"/>
-        </w:rPr>
-        <w:t xml:space="preserve">open_from（v0.2</w:t>
-      </w:r>
-      <w:r>
-        <w:rPr>
-          <w:rStyle w:val="VerbatimChar"/>
-        </w:rPr>
-        <w:t xml:space="preserve"> </w:t>
-      </w:r>
-      <w:r>
-        <w:rPr>
-          <w:rStyle w:val="VerbatimChar"/>
-          <w:rFonts w:hint="eastAsia"/>
-        </w:rPr>
-        <w:t xml:space="preserve">中</w:t>
-      </w:r>
-      <w:r>
-        <w:rPr>
-          <w:rStyle w:val="VerbatimChar"/>
-        </w:rPr>
-        <w:t xml:space="preserve"> open-to / open_from </w:t>
-      </w:r>
-      <w:r>
-        <w:rPr>
-          <w:rStyle w:val="VerbatimChar"/>
-          <w:rFonts w:hint="eastAsia"/>
-        </w:rPr>
-        <w:t xml:space="preserve">混用）。</w:t>
-      </w:r>
-      <w:r>
-        <w:br/>
-      </w:r>
-      <w:r>
-        <w:rPr>
-          <w:rStyle w:val="VerbatimChar"/>
-        </w:rPr>
-        <w:t xml:space="preserve">2. §9 </w:t>
-      </w:r>
-      <w:r>
-        <w:rPr>
-          <w:rStyle w:val="VerbatimChar"/>
-          <w:rFonts w:hint="eastAsia"/>
-        </w:rPr>
-        <w:t xml:space="preserve">增加方向与范围声明：v0.3</w:t>
-      </w:r>
-      <w:r>
-        <w:rPr>
-          <w:rStyle w:val="VerbatimChar"/>
-        </w:rPr>
-        <w:t xml:space="preserve"> </w:t>
-      </w:r>
-      <w:r>
-        <w:rPr>
-          <w:rStyle w:val="VerbatimChar"/>
-          <w:rFonts w:hint="eastAsia"/>
-        </w:rPr>
-        <w:t xml:space="preserve">仅处理</w:t>
-      </w:r>
-      <w:r>
-        <w:rPr>
-          <w:rStyle w:val="VerbatimChar"/>
-        </w:rPr>
-        <w:t xml:space="preserve"> input </w:t>
-      </w:r>
-      <w:r>
-        <w:rPr>
-          <w:rStyle w:val="VerbatimChar"/>
-          <w:rFonts w:hint="eastAsia"/>
-        </w:rPr>
-        <w:t xml:space="preserve">方向（S</w:t>
-      </w:r>
-      <w:r>
-        <w:rPr>
-          <w:rStyle w:val="VerbatimChar"/>
-        </w:rPr>
-        <w:t xml:space="preserve"> -&gt; B -&gt; </w:t>
-      </w:r>
-      <w:r>
-        <w:rPr>
-          <w:rStyle w:val="VerbatimChar"/>
-          <w:rFonts w:hint="eastAsia"/>
-        </w:rPr>
-        <w:t xml:space="preserve">E）；output</w:t>
-      </w:r>
-      <w:r>
-        <w:rPr>
-          <w:rStyle w:val="VerbatimChar"/>
-        </w:rPr>
-        <w:t xml:space="preserve"> </w:t>
-      </w:r>
-      <w:r>
-        <w:rPr>
-          <w:rStyle w:val="VerbatimChar"/>
-          <w:rFonts w:hint="eastAsia"/>
-        </w:rPr>
-        <w:t xml:space="preserve">方向与多跳链不自动合并。</w:t>
-      </w:r>
-      <w:r>
-        <w:br/>
-      </w:r>
-      <w:r>
-        <w:rPr>
-          <w:rStyle w:val="VerbatimChar"/>
-        </w:rPr>
-        <w:t xml:space="preserve">3. §10 </w:t>
-      </w:r>
-      <w:r>
-        <w:rPr>
-          <w:rStyle w:val="VerbatimChar"/>
-          <w:rFonts w:hint="eastAsia"/>
-        </w:rPr>
-        <w:t xml:space="preserve">增加</w:t>
-      </w:r>
-      <w:r>
-        <w:rPr>
-          <w:rStyle w:val="VerbatimChar"/>
-        </w:rPr>
-        <w:t xml:space="preserve"> segment </w:t>
-      </w:r>
-      <w:r>
-        <w:rPr>
-          <w:rStyle w:val="VerbatimChar"/>
-          <w:rFonts w:hint="eastAsia"/>
-        </w:rPr>
-        <w:t xml:space="preserve">分类规则：非</w:t>
-      </w:r>
-      <w:r>
-        <w:rPr>
-          <w:rStyle w:val="VerbatimChar"/>
-        </w:rPr>
-        <w:t xml:space="preserve"> merge candidate </w:t>
-      </w:r>
-      <w:r>
-        <w:rPr>
-          <w:rStyle w:val="VerbatimChar"/>
-          <w:rFonts w:hint="eastAsia"/>
-        </w:rPr>
-        <w:t xml:space="preserve">的段</w:t>
-      </w:r>
-      <w:r>
-        <w:rPr>
-          <w:rStyle w:val="VerbatimChar"/>
-        </w:rPr>
-        <w:t xml:space="preserve"> </w:t>
-      </w:r>
-      <w:r>
-        <w:rPr>
-          <w:rStyle w:val="VerbatimChar"/>
-          <w:rFonts w:hint="eastAsia"/>
-        </w:rPr>
-        <w:t xml:space="preserve">passthrough，不进</w:t>
-      </w:r>
-      <w:r>
-        <w:rPr>
-          <w:rStyle w:val="VerbatimChar"/>
-        </w:rPr>
-        <w:t xml:space="preserve"> review。</w:t>
-      </w:r>
-      <w:r>
-        <w:br/>
-      </w:r>
-      <w:r>
-        <w:rPr>
-          <w:rStyle w:val="VerbatimChar"/>
-        </w:rPr>
-        <w:t xml:space="preserve">4. §13 </w:t>
-      </w:r>
-      <w:r>
-        <w:rPr>
-          <w:rStyle w:val="VerbatimChar"/>
-          <w:rFonts w:hint="eastAsia"/>
-        </w:rPr>
-        <w:t xml:space="preserve">增加</w:t>
-      </w:r>
-      <w:r>
-        <w:rPr>
-          <w:rStyle w:val="VerbatimChar"/>
-        </w:rPr>
-        <w:t xml:space="preserve"> clock / edge-specific </w:t>
-      </w:r>
-      <w:r>
-        <w:rPr>
-          <w:rStyle w:val="VerbatimChar"/>
-          <w:rFonts w:hint="eastAsia"/>
-        </w:rPr>
-        <w:t xml:space="preserve">对象处理，增加生成前</w:t>
-      </w:r>
-      <w:r>
-        <w:rPr>
-          <w:rStyle w:val="VerbatimChar"/>
-        </w:rPr>
-        <w:t xml:space="preserve"> startpoint/endpoint </w:t>
-      </w:r>
-      <w:r>
-        <w:rPr>
-          <w:rStyle w:val="VerbatimChar"/>
-          <w:rFonts w:hint="eastAsia"/>
-        </w:rPr>
-        <w:t xml:space="preserve">合法性预检。</w:t>
-      </w:r>
-      <w:r>
-        <w:br/>
-      </w:r>
-      <w:r>
-        <w:rPr>
-          <w:rStyle w:val="VerbatimChar"/>
-        </w:rPr>
-        <w:t xml:space="preserve">5. §14 </w:t>
-      </w:r>
-      <w:r>
-        <w:rPr>
-          <w:rStyle w:val="VerbatimChar"/>
-          <w:rFonts w:hint="eastAsia"/>
-        </w:rPr>
-        <w:t xml:space="preserve">修正</w:t>
-      </w:r>
-      <w:r>
-        <w:rPr>
-          <w:rStyle w:val="VerbatimChar"/>
-        </w:rPr>
-        <w:t xml:space="preserve"> B_set </w:t>
-      </w:r>
-      <w:r>
-        <w:rPr>
-          <w:rStyle w:val="VerbatimChar"/>
-          <w:rFonts w:hint="eastAsia"/>
-        </w:rPr>
-        <w:t xml:space="preserve">推导：all_fanin</w:t>
-      </w:r>
-      <w:r>
-        <w:rPr>
-          <w:rStyle w:val="VerbatimChar"/>
-        </w:rPr>
-        <w:t xml:space="preserve"> -flat </w:t>
-      </w:r>
-      <w:r>
-        <w:rPr>
-          <w:rStyle w:val="VerbatimChar"/>
-          <w:rFonts w:hint="eastAsia"/>
-        </w:rPr>
-        <w:t xml:space="preserve">结果不含</w:t>
-      </w:r>
-      <w:r>
-        <w:rPr>
-          <w:rStyle w:val="VerbatimChar"/>
-        </w:rPr>
-        <w:t xml:space="preserve"> hierarchical </w:t>
-      </w:r>
-      <w:r>
-        <w:rPr>
-          <w:rStyle w:val="VerbatimChar"/>
-          <w:rFonts w:hint="eastAsia"/>
-        </w:rPr>
-        <w:t xml:space="preserve">pin，禁止用于</w:t>
-      </w:r>
-      <w:r>
-        <w:rPr>
-          <w:rStyle w:val="VerbatimChar"/>
-        </w:rPr>
-        <w:t xml:space="preserve"> B_set </w:t>
-      </w:r>
-      <w:r>
-        <w:rPr>
-          <w:rStyle w:val="VerbatimChar"/>
-          <w:rFonts w:hint="eastAsia"/>
-        </w:rPr>
-        <w:t xml:space="preserve">求交。</w:t>
-      </w:r>
-      <w:r>
-        <w:br/>
-      </w:r>
-      <w:r>
-        <w:rPr>
-          <w:rStyle w:val="VerbatimChar"/>
-        </w:rPr>
-        <w:t xml:space="preserve">6. §17 </w:t>
-      </w:r>
-      <w:r>
-        <w:rPr>
-          <w:rStyle w:val="VerbatimChar"/>
-          <w:rFonts w:hint="eastAsia"/>
-        </w:rPr>
-        <w:t xml:space="preserve">增加</w:t>
-      </w:r>
-      <w:r>
-        <w:rPr>
-          <w:rStyle w:val="VerbatimChar"/>
-        </w:rPr>
-        <w:t xml:space="preserve"> D_int </w:t>
-      </w:r>
-      <w:r>
-        <w:rPr>
-          <w:rStyle w:val="VerbatimChar"/>
-          <w:rFonts w:hint="eastAsia"/>
-        </w:rPr>
-        <w:t xml:space="preserve">预算语义假设与</w:t>
-      </w:r>
-      <w:r>
-        <w:rPr>
-          <w:rStyle w:val="VerbatimChar"/>
-        </w:rPr>
-        <w:t xml:space="preserve"> input_delay </w:t>
-      </w:r>
-      <w:r>
-        <w:rPr>
-          <w:rStyle w:val="VerbatimChar"/>
-          <w:rFonts w:hint="eastAsia"/>
-        </w:rPr>
-        <w:t xml:space="preserve">叠加检查。</w:t>
-      </w:r>
-      <w:r>
-        <w:br/>
-      </w:r>
-      <w:r>
-        <w:rPr>
-          <w:rStyle w:val="VerbatimChar"/>
-        </w:rPr>
-        <w:t xml:space="preserve">7. §18 </w:t>
-      </w:r>
-      <w:r>
-        <w:rPr>
-          <w:rStyle w:val="VerbatimChar"/>
-          <w:rFonts w:hint="eastAsia"/>
-        </w:rPr>
-        <w:t xml:space="preserve">增加</w:t>
-      </w:r>
-      <w:r>
-        <w:rPr>
-          <w:rStyle w:val="VerbatimChar"/>
-        </w:rPr>
-        <w:t xml:space="preserve"> replace mode </w:t>
-      </w:r>
-      <w:r>
-        <w:rPr>
-          <w:rStyle w:val="VerbatimChar"/>
-          <w:rFonts w:hint="eastAsia"/>
-        </w:rPr>
-        <w:t xml:space="preserve">覆盖完整性规则与</w:t>
-      </w:r>
-      <w:r>
-        <w:rPr>
-          <w:rStyle w:val="VerbatimChar"/>
-        </w:rPr>
-        <w:t xml:space="preserve"> partial merge policy。</w:t>
-      </w:r>
-      <w:r>
-        <w:br/>
-      </w:r>
-      <w:r>
-        <w:rPr>
-          <w:rStyle w:val="VerbatimChar"/>
-        </w:rPr>
-        <w:t xml:space="preserve">8. §19 / §20 / §21 / §22 / §23 / §24 </w:t>
-      </w:r>
-      <w:r>
-        <w:rPr>
-          <w:rStyle w:val="VerbatimChar"/>
-          <w:rFonts w:hint="eastAsia"/>
-        </w:rPr>
-        <w:t xml:space="preserve">相应扩充。</w:t>
+        <w:t>1. 新增 open_to 术语：有 -from、缺 -to。</w:t>
+        <w:br/>
+        <w:t>2. open_to 从最后一级 -through（否则 -from）调用 PT all_fanout -flat -endpoints_only 推导 endpoint。</w:t>
+        <w:br/>
+        <w:t>3. top open_to 进入 harden 时必须先恢复唯一 input boundary，再参与递归累加。</w:t>
+        <w:br/>
+        <w:t>4. 多 endpoint 必须完整展开；同一最终静态约束只输出一次，但每个原始 endpoint 都要记账。</w:t>
+        <w:br/>
+        <w:t>5. -through [list ...] 保持为同一 through stage，不得拆成连续 through stage。</w:t>
+        <w:br/>
+        <w:t>6. 推导失败、超限或 boundary 不唯一时不 consume 原文。</w:t>
+        <w:br/>
+        <w:t>7. 同一路径真实 delay segment 的 option 必须一致，一致时写回最终命令。</w:t>
       </w:r>
     </w:p>
     <w:p>
@@ -3871,13 +3434,7 @@
         <w:pStyle w:val="Heading3"/>
       </w:pPr>
       <w:r>
-        <w:t xml:space="preserve">9.4 </w:t>
-      </w:r>
-      <w:r>
-        <w:rPr>
-          <w:rFonts w:hint="eastAsia"/>
-        </w:rPr>
-        <w:t xml:space="preserve">方向与范围限制（v0.3）</w:t>
+        <w:t>9.4 方向与递归范围（v0.4）</w:t>
       </w:r>
     </w:p>
     <w:p>
@@ -3885,40 +3442,7 @@
         <w:pStyle w:val="FirstParagraph"/>
       </w:pPr>
       <w:r>
-        <w:t xml:space="preserve">v0.3 </w:t>
-      </w:r>
-      <w:r>
-        <w:rPr>
-          <w:rFonts w:hint="eastAsia"/>
-        </w:rPr>
-        <w:t xml:space="preserve">只自动合并</w:t>
-      </w:r>
-      <w:r>
-        <w:t xml:space="preserve"> </w:t>
-      </w:r>
-      <w:r>
-        <w:rPr>
-          <w:b/>
-          <w:bCs/>
-        </w:rPr>
-        <w:t xml:space="preserve">input </w:t>
-      </w:r>
-      <w:r>
-        <w:rPr>
-          <w:rFonts w:hint="eastAsia"/>
-          <w:b/>
-          <w:bCs/>
-        </w:rPr>
-        <w:t xml:space="preserve">方向单跳</w:t>
-      </w:r>
-      <w:r>
-        <w:t xml:space="preserve"> </w:t>
-      </w:r>
-      <w:r>
-        <w:rPr>
-          <w:rFonts w:hint="eastAsia"/>
-        </w:rPr>
-        <w:t xml:space="preserve">场景：</w:t>
+        <w:t>v0.4 支持 input 方向单跳、harden input-to-output feedthrough、harden output 到下游 harden input 的自动递归链，以及缺失 top/harden stage 按 0 处理。</w:t>
       </w:r>
     </w:p>
     <w:p>
@@ -3926,10 +3450,7 @@
         <w:pStyle w:val="SourceCode"/>
       </w:pPr>
       <w:r>
-        <w:rPr>
-          <w:rStyle w:val="VerbatimChar"/>
-        </w:rPr>
-        <w:t xml:space="preserve">S (top) -&gt; B (harden boundary input) -&gt; E (harden internal endpoint)</w:t>
+        <w:t>递归链示例：harden_a.internal_start -&gt; harden_a.output -&gt; harden_b.input -&gt; harden_b.internal_endpoint。</w:t>
       </w:r>
     </w:p>
     <w:p>
@@ -3937,19 +3458,7 @@
         <w:pStyle w:val="FirstParagraph"/>
       </w:pPr>
       <w:r>
-        <w:rPr>
-          <w:rFonts w:hint="eastAsia"/>
-        </w:rPr>
-        <w:t xml:space="preserve">以下场景</w:t>
-      </w:r>
-      <w:r>
-        <w:t xml:space="preserve"> v0.3 </w:t>
-      </w:r>
-      <w:r>
-        <w:rPr>
-          <w:rFonts w:hint="eastAsia"/>
-        </w:rPr>
-        <w:t xml:space="preserve">不自动合并：</w:t>
+        <w:t>以下情况不自动生成：</w:t>
       </w:r>
     </w:p>
     <w:p>
@@ -3957,322 +3466,15 @@
         <w:pStyle w:val="SourceCode"/>
       </w:pPr>
       <w:r>
-        <w:rPr>
-          <w:rStyle w:val="VerbatimChar"/>
-        </w:rPr>
-        <w:t xml:space="preserve">1. output </w:t>
-      </w:r>
-      <w:r>
-        <w:rPr>
-          <w:rStyle w:val="VerbatimChar"/>
-          <w:rFonts w:hint="eastAsia"/>
-        </w:rPr>
-        <w:t xml:space="preserve">方向：</w:t>
-      </w:r>
-      <w:r>
-        <w:br/>
-      </w:r>
-      <w:r>
-        <w:rPr>
-          <w:rStyle w:val="VerbatimChar"/>
-        </w:rPr>
-        <w:t xml:space="preserve">       harden internal startpoint -&gt; harden boundary output -&gt; top destination</w:t>
-      </w:r>
-      <w:r>
-        <w:br/>
-      </w:r>
-      <w:r>
-        <w:rPr>
-          <w:rStyle w:val="VerbatimChar"/>
-        </w:rPr>
-        <w:t xml:space="preserve">   </w:t>
-      </w:r>
-      <w:r>
-        <w:rPr>
-          <w:rStyle w:val="VerbatimChar"/>
-          <w:rFonts w:hint="eastAsia"/>
-        </w:rPr>
-        <w:t xml:space="preserve">相关段</w:t>
-      </w:r>
-      <w:r>
-        <w:rPr>
-          <w:rStyle w:val="VerbatimChar"/>
-        </w:rPr>
-        <w:t xml:space="preserve"> passthrough </w:t>
-      </w:r>
-      <w:r>
-        <w:rPr>
-          <w:rStyle w:val="VerbatimChar"/>
-          <w:rFonts w:hint="eastAsia"/>
-        </w:rPr>
-        <w:t xml:space="preserve">原样保留，report</w:t>
-      </w:r>
-      <w:r>
-        <w:rPr>
-          <w:rStyle w:val="VerbatimChar"/>
-        </w:rPr>
-        <w:t xml:space="preserve"> </w:t>
-      </w:r>
-      <w:r>
-        <w:rPr>
-          <w:rStyle w:val="VerbatimChar"/>
-          <w:rFonts w:hint="eastAsia"/>
-        </w:rPr>
-        <w:t xml:space="preserve">中标记</w:t>
-      </w:r>
-      <w:r>
-        <w:rPr>
-          <w:rStyle w:val="VerbatimChar"/>
-        </w:rPr>
-        <w:t xml:space="preserve"> DIRECTION_NOT_SUPPORTED。</w:t>
-      </w:r>
-      <w:r>
-        <w:br/>
-      </w:r>
-      <w:r>
-        <w:br/>
-      </w:r>
-      <w:r>
-        <w:rPr>
-          <w:rStyle w:val="VerbatimChar"/>
-        </w:rPr>
-        <w:t xml:space="preserve">2. harden-to-harden </w:t>
-      </w:r>
-      <w:r>
-        <w:rPr>
-          <w:rStyle w:val="VerbatimChar"/>
-          <w:rFonts w:hint="eastAsia"/>
-        </w:rPr>
-        <w:t xml:space="preserve">多跳链（&gt;=</w:t>
-      </w:r>
-      <w:r>
-        <w:rPr>
-          <w:rStyle w:val="VerbatimChar"/>
-        </w:rPr>
-        <w:t xml:space="preserve"> 3 </w:t>
-      </w:r>
-      <w:r>
-        <w:rPr>
-          <w:rStyle w:val="VerbatimChar"/>
-          <w:rFonts w:hint="eastAsia"/>
-        </w:rPr>
-        <w:t xml:space="preserve">段，例如</w:t>
-      </w:r>
-      <w:r>
-        <w:rPr>
-          <w:rStyle w:val="VerbatimChar"/>
-        </w:rPr>
-        <w:t xml:space="preserve"> ucie0 </w:t>
-      </w:r>
-      <w:r>
-        <w:rPr>
-          <w:rStyle w:val="VerbatimChar"/>
-          <w:rFonts w:hint="eastAsia"/>
-        </w:rPr>
-        <w:t xml:space="preserve">输出经</w:t>
-      </w:r>
-      <w:r>
-        <w:rPr>
-          <w:rStyle w:val="VerbatimChar"/>
-        </w:rPr>
-        <w:t xml:space="preserve"> top </w:t>
-      </w:r>
-      <w:r>
-        <w:rPr>
-          <w:rStyle w:val="VerbatimChar"/>
-          <w:rFonts w:hint="eastAsia"/>
-        </w:rPr>
-        <w:t xml:space="preserve">组合逻辑到</w:t>
-      </w:r>
-      <w:r>
-        <w:br/>
-      </w:r>
-      <w:r>
-        <w:rPr>
-          <w:rStyle w:val="VerbatimChar"/>
-        </w:rPr>
-        <w:t xml:space="preserve">   ucie1 </w:t>
-      </w:r>
-      <w:r>
-        <w:rPr>
-          <w:rStyle w:val="VerbatimChar"/>
-          <w:rFonts w:hint="eastAsia"/>
-        </w:rPr>
-        <w:t xml:space="preserve">输入）：</w:t>
-      </w:r>
-      <w:r>
-        <w:br/>
-      </w:r>
-      <w:r>
-        <w:rPr>
-          <w:rStyle w:val="VerbatimChar"/>
-        </w:rPr>
-        <w:t xml:space="preserve">   top </w:t>
-      </w:r>
-      <w:r>
-        <w:rPr>
-          <w:rStyle w:val="VerbatimChar"/>
-          <w:rFonts w:hint="eastAsia"/>
-        </w:rPr>
-        <w:t xml:space="preserve">段的</w:t>
-      </w:r>
-      <w:r>
-        <w:rPr>
-          <w:rStyle w:val="VerbatimChar"/>
-        </w:rPr>
-        <w:t xml:space="preserve"> -from </w:t>
-      </w:r>
-      <w:r>
-        <w:rPr>
-          <w:rStyle w:val="VerbatimChar"/>
-          <w:rFonts w:hint="eastAsia"/>
-        </w:rPr>
-        <w:t xml:space="preserve">为上游</w:t>
-      </w:r>
-      <w:r>
-        <w:rPr>
-          <w:rStyle w:val="VerbatimChar"/>
-        </w:rPr>
-        <w:t xml:space="preserve"> harden boundary output </w:t>
-      </w:r>
-      <w:r>
-        <w:rPr>
-          <w:rStyle w:val="VerbatimChar"/>
-          <w:rFonts w:hint="eastAsia"/>
-        </w:rPr>
-        <w:t xml:space="preserve">pin（hierarchical</w:t>
-      </w:r>
-      <w:r>
-        <w:rPr>
-          <w:rStyle w:val="VerbatimChar"/>
-        </w:rPr>
-        <w:t xml:space="preserve"> </w:t>
-      </w:r>
-      <w:r>
-        <w:rPr>
-          <w:rStyle w:val="VerbatimChar"/>
-          <w:rFonts w:hint="eastAsia"/>
-        </w:rPr>
-        <w:t xml:space="preserve">pin，</w:t>
-      </w:r>
-      <w:r>
-        <w:br/>
-      </w:r>
-      <w:r>
-        <w:rPr>
-          <w:rStyle w:val="VerbatimChar"/>
-        </w:rPr>
-        <w:t xml:space="preserve">   </w:t>
-      </w:r>
-      <w:r>
-        <w:rPr>
-          <w:rStyle w:val="VerbatimChar"/>
-          <w:rFonts w:hint="eastAsia"/>
-        </w:rPr>
-        <w:t xml:space="preserve">不是合法</w:t>
-      </w:r>
-      <w:r>
-        <w:rPr>
-          <w:rStyle w:val="VerbatimChar"/>
-        </w:rPr>
-        <w:t xml:space="preserve"> </w:t>
-      </w:r>
-      <w:r>
-        <w:rPr>
-          <w:rStyle w:val="VerbatimChar"/>
-          <w:rFonts w:hint="eastAsia"/>
-        </w:rPr>
-        <w:t xml:space="preserve">startpoint，见</w:t>
-      </w:r>
-      <w:r>
-        <w:rPr>
-          <w:rStyle w:val="VerbatimChar"/>
-        </w:rPr>
-        <w:t xml:space="preserve"> </w:t>
-      </w:r>
-      <w:r>
-        <w:rPr>
-          <w:rStyle w:val="VerbatimChar"/>
-          <w:rFonts w:hint="eastAsia"/>
-        </w:rPr>
-        <w:t xml:space="preserve">§13.1），不得只合并其中两段——那样生成约束的</w:t>
-      </w:r>
-      <w:r>
-        <w:br/>
-      </w:r>
-      <w:r>
-        <w:rPr>
-          <w:rStyle w:val="VerbatimChar"/>
-        </w:rPr>
-        <w:t xml:space="preserve">   </w:t>
-      </w:r>
-      <w:r>
-        <w:rPr>
-          <w:rStyle w:val="VerbatimChar"/>
-          <w:rFonts w:hint="eastAsia"/>
-        </w:rPr>
-        <w:t xml:space="preserve">路径起点会落在上游</w:t>
-      </w:r>
-      <w:r>
-        <w:rPr>
-          <w:rStyle w:val="VerbatimChar"/>
-        </w:rPr>
-        <w:t xml:space="preserve"> harden </w:t>
-      </w:r>
-      <w:r>
-        <w:rPr>
-          <w:rStyle w:val="VerbatimChar"/>
-          <w:rFonts w:hint="eastAsia"/>
-        </w:rPr>
-        <w:t xml:space="preserve">内部</w:t>
-      </w:r>
-      <w:r>
-        <w:rPr>
-          <w:rStyle w:val="VerbatimChar"/>
-        </w:rPr>
-        <w:t xml:space="preserve"> </w:t>
-      </w:r>
-      <w:r>
-        <w:rPr>
-          <w:rStyle w:val="VerbatimChar"/>
-          <w:rFonts w:hint="eastAsia"/>
-        </w:rPr>
-        <w:t xml:space="preserve">startpoint，而预算不含上游内部段，</w:t>
-      </w:r>
-      <w:r>
-        <w:br/>
-      </w:r>
-      <w:r>
-        <w:rPr>
-          <w:rStyle w:val="VerbatimChar"/>
-        </w:rPr>
-        <w:t xml:space="preserve">   </w:t>
-      </w:r>
-      <w:r>
-        <w:rPr>
-          <w:rStyle w:val="VerbatimChar"/>
-          <w:rFonts w:hint="eastAsia"/>
-        </w:rPr>
-        <w:t xml:space="preserve">语义错误。该类段进入</w:t>
-      </w:r>
-      <w:r>
-        <w:rPr>
-          <w:rStyle w:val="VerbatimChar"/>
-        </w:rPr>
-        <w:t xml:space="preserve"> </w:t>
-      </w:r>
-      <w:r>
-        <w:rPr>
-          <w:rStyle w:val="VerbatimChar"/>
-          <w:rFonts w:hint="eastAsia"/>
-        </w:rPr>
-        <w:t xml:space="preserve">review，标记</w:t>
-      </w:r>
-      <w:r>
-        <w:rPr>
-          <w:rStyle w:val="VerbatimChar"/>
-        </w:rPr>
-        <w:t xml:space="preserve"> MULTI_HOP_NOT_SUPPORTED。</w:t>
+        <w:t>1. PT 无法证明 boundary、startpoint、endpoint 或跨层连接。</w:t>
+        <w:br/>
+        <w:t>2. 路径超过 MAX_CHAIN_DEPTH。</w:t>
+        <w:br/>
+        <w:t>3. 生成后的 -from/-to 不是合法 timing startpoint/endpoint。</w:t>
+        <w:br/>
+        <w:t>4. output 方向无法恢复上游内部 startpoint 或下游合法 endpoint。</w:t>
+        <w:br/>
+        <w:t>5. max/min 类型或 delay option 不一致。</w:t>
       </w:r>
     </w:p>
     <w:p>
@@ -4280,40 +3482,7 @@
         <w:pStyle w:val="FirstParagraph"/>
       </w:pPr>
       <w:r>
-        <w:rPr>
-          <w:rFonts w:hint="eastAsia"/>
-        </w:rPr>
-        <w:t xml:space="preserve">后续版本若扩展</w:t>
-      </w:r>
-      <w:r>
-        <w:t xml:space="preserve"> output </w:t>
-      </w:r>
-      <w:r>
-        <w:rPr>
-          <w:rFonts w:hint="eastAsia"/>
-        </w:rPr>
-        <w:t xml:space="preserve">方向</w:t>
-      </w:r>
-      <w:r>
-        <w:t xml:space="preserve"> / </w:t>
-      </w:r>
-      <w:r>
-        <w:rPr>
-          <w:rFonts w:hint="eastAsia"/>
-        </w:rPr>
-        <w:t xml:space="preserve">多跳链，须按本文档同等强度定义</w:t>
-      </w:r>
-      <w:r>
-        <w:t xml:space="preserve"> </w:t>
-      </w:r>
-      <w:r>
-        <w:t xml:space="preserve">boundary </w:t>
-      </w:r>
-      <w:r>
-        <w:rPr>
-          <w:rFonts w:hint="eastAsia"/>
-        </w:rPr>
-        <w:t xml:space="preserve">推导、覆盖完整性与合法性预检规则。</w:t>
+        <w:t>递归只沿 PT 可证明的真实 fanin/fanout 和 harden boundary 前进；不得依靠端口命名规则猜测方向或连接。</w:t>
       </w:r>
     </w:p>
     <w:p>
@@ -4390,129 +3559,29 @@
         <w:pStyle w:val="SourceCode"/>
       </w:pPr>
       <w:r>
-        <w:rPr>
-          <w:rStyle w:val="VerbatimChar"/>
-        </w:rPr>
-        <w:t xml:space="preserve">type          = max / min</w:t>
-      </w:r>
-      <w:r>
-        <w:br/>
-      </w:r>
-      <w:r>
-        <w:rPr>
-          <w:rStyle w:val="VerbatimChar"/>
-        </w:rPr>
-        <w:t xml:space="preserve">kind          = complete / open_from</w:t>
-      </w:r>
-      <w:r>
-        <w:br/>
-      </w:r>
-      <w:r>
-        <w:rPr>
-          <w:rStyle w:val="VerbatimChar"/>
-        </w:rPr>
-        <w:t xml:space="preserve">from          = object list </w:t>
-      </w:r>
-      <w:r>
-        <w:rPr>
-          <w:rStyle w:val="VerbatimChar"/>
-          <w:rFonts w:hint="eastAsia"/>
-        </w:rPr>
-        <w:t xml:space="preserve">或</w:t>
-      </w:r>
-      <w:r>
-        <w:rPr>
-          <w:rStyle w:val="VerbatimChar"/>
-        </w:rPr>
-        <w:t xml:space="preserve"> OPEN</w:t>
-      </w:r>
-      <w:r>
-        <w:br/>
-      </w:r>
-      <w:r>
-        <w:rPr>
-          <w:rStyle w:val="VerbatimChar"/>
-        </w:rPr>
-        <w:t xml:space="preserve">to            = object list</w:t>
-      </w:r>
-      <w:r>
-        <w:br/>
-      </w:r>
-      <w:r>
-        <w:rPr>
-          <w:rStyle w:val="VerbatimChar"/>
-        </w:rPr>
-        <w:t xml:space="preserve">through       = object </w:t>
-      </w:r>
-      <w:r>
-        <w:rPr>
-          <w:rStyle w:val="VerbatimChar"/>
-          <w:rFonts w:hint="eastAsia"/>
-        </w:rPr>
-        <w:t xml:space="preserve">list，可选</w:t>
-      </w:r>
-      <w:r>
-        <w:br/>
-      </w:r>
-      <w:r>
-        <w:rPr>
-          <w:rStyle w:val="VerbatimChar"/>
-        </w:rPr>
-        <w:t xml:space="preserve">delay         = numeric value</w:t>
-      </w:r>
-      <w:r>
-        <w:br/>
-      </w:r>
-      <w:r>
-        <w:rPr>
-          <w:rStyle w:val="VerbatimChar"/>
-        </w:rPr>
-        <w:t xml:space="preserve">flags         = option list</w:t>
-      </w:r>
-      <w:r>
-        <w:br/>
-      </w:r>
-      <w:r>
-        <w:rPr>
-          <w:rStyle w:val="VerbatimChar"/>
-        </w:rPr>
-        <w:t xml:space="preserve">source        = top / harden</w:t>
-      </w:r>
-      <w:r>
-        <w:br/>
-      </w:r>
-      <w:r>
-        <w:rPr>
-          <w:rStyle w:val="VerbatimChar"/>
-        </w:rPr>
-        <w:t xml:space="preserve">source_file</w:t>
-      </w:r>
-      <w:r>
-        <w:br/>
-      </w:r>
-      <w:r>
-        <w:rPr>
-          <w:rStyle w:val="VerbatimChar"/>
-        </w:rPr>
-        <w:t xml:space="preserve">line_no</w:t>
-      </w:r>
-      <w:r>
-        <w:br/>
-      </w:r>
-      <w:r>
-        <w:rPr>
-          <w:rStyle w:val="VerbatimChar"/>
-        </w:rPr>
-        <w:t xml:space="preserve">command_id</w:t>
-      </w:r>
-      <w:r>
-        <w:br/>
-      </w:r>
-      <w:r>
-        <w:rPr>
-          <w:rStyle w:val="VerbatimChar"/>
-        </w:rPr>
-        <w:t xml:space="preserve">original_text</w:t>
+        <w:t>type          = max / min</w:t>
+        <w:br/>
+        <w:t>kind          = complete / open_from / open_to</w:t>
+        <w:br/>
+        <w:t>from          = object list 或 OPEN</w:t>
+        <w:br/>
+        <w:t>to            = object list、OPEN 或 PT 推导结果</w:t>
+        <w:br/>
+        <w:t>through       = 按 option 分组的 object collection，可选</w:t>
+        <w:br/>
+        <w:t>delay         = numeric value</w:t>
+        <w:br/>
+        <w:t>flags         = option list</w:t>
+        <w:br/>
+        <w:t>source        = top / harden</w:t>
+        <w:br/>
+        <w:t>source_file</w:t>
+        <w:br/>
+        <w:t>line_no</w:t>
+        <w:br/>
+        <w:t>command_id</w:t>
+        <w:br/>
+        <w:t>original_text</w:t>
       </w:r>
     </w:p>
     <w:p>
@@ -4520,80 +3589,7 @@
         <w:pStyle w:val="FirstParagraph"/>
       </w:pPr>
       <w:r>
-        <w:rPr>
-          <w:rFonts w:hint="eastAsia"/>
-        </w:rPr>
-        <w:t xml:space="preserve">术语约定：本文档中</w:t>
-      </w:r>
-      <w:r>
-        <w:t xml:space="preserve"> </w:t>
-      </w:r>
-      <w:r>
-        <w:rPr>
-          <w:b/>
-          <w:bCs/>
-        </w:rPr>
-        <w:t xml:space="preserve">open_from</w:t>
-      </w:r>
-      <w:r>
-        <w:t xml:space="preserve"> </w:t>
-      </w:r>
-      <w:r>
-        <w:rPr>
-          <w:rFonts w:hint="eastAsia"/>
-        </w:rPr>
-        <w:t xml:space="preserve">统一指”只有</w:t>
-      </w:r>
-      <w:r>
-        <w:t xml:space="preserve"> </w:t>
-      </w:r>
-      <w:r>
-        <w:rPr>
-          <w:rStyle w:val="VerbatimChar"/>
-        </w:rPr>
-        <w:t xml:space="preserve">-to</w:t>
-      </w:r>
-      <w:r>
-        <w:rPr>
-          <w:rFonts w:hint="eastAsia"/>
-        </w:rPr>
-        <w:t xml:space="preserve">、没有</w:t>
-      </w:r>
-      <w:r>
-        <w:t xml:space="preserve"> </w:t>
-      </w:r>
-      <w:r>
-        <w:rPr>
-          <w:rStyle w:val="VerbatimChar"/>
-        </w:rPr>
-        <w:t xml:space="preserve">-from</w:t>
-      </w:r>
-      <w:r>
-        <w:rPr>
-          <w:rFonts w:hint="eastAsia"/>
-        </w:rPr>
-        <w:t xml:space="preserve">“的</w:t>
-      </w:r>
-      <w:r>
-        <w:t xml:space="preserve"> </w:t>
-      </w:r>
-      <w:r>
-        <w:t xml:space="preserve">delay </w:t>
-      </w:r>
-      <w:r>
-        <w:rPr>
-          <w:rFonts w:hint="eastAsia"/>
-        </w:rPr>
-        <w:t xml:space="preserve">约束。不再使用</w:t>
-      </w:r>
-      <w:r>
-        <w:t xml:space="preserve"> open-to </w:t>
-      </w:r>
-      <w:r>
-        <w:rPr>
-          <w:rFonts w:hint="eastAsia"/>
-        </w:rPr>
-        <w:t xml:space="preserve">一词。</w:t>
+        <w:t>术语约定：open_from 指只有 -to、没有 -from；open_to 指有 -from、没有 -to。</w:t>
       </w:r>
     </w:p>
     <w:bookmarkStart w:id="23" w:name="complete-delay"/>
@@ -4787,25 +3783,7 @@
         <w:pStyle w:val="Heading3"/>
       </w:pPr>
       <w:r>
-        <w:t xml:space="preserve">10.3 </w:t>
-      </w:r>
-      <w:r>
-        <w:rPr>
-          <w:rFonts w:hint="eastAsia"/>
-        </w:rPr>
-        <w:t xml:space="preserve">没有</w:t>
-      </w:r>
-      <w:r>
-        <w:t xml:space="preserve"> -to </w:t>
-      </w:r>
-      <w:r>
-        <w:rPr>
-          <w:rFonts w:hint="eastAsia"/>
-        </w:rPr>
-        <w:t xml:space="preserve">的</w:t>
-      </w:r>
-      <w:r>
-        <w:t xml:space="preserve"> delay</w:t>
+        <w:t>10.3 open_to delay</w:t>
       </w:r>
     </w:p>
     <w:p>
@@ -4813,61 +3791,11 @@
         <w:pStyle w:val="FirstParagraph"/>
       </w:pPr>
       <w:r>
-        <w:rPr>
-          <w:rFonts w:hint="eastAsia"/>
-        </w:rPr>
-        <w:t xml:space="preserve">没有</w:t>
-      </w:r>
-      <w:r>
-        <w:t xml:space="preserve"> </w:t>
-      </w:r>
-      <w:r>
-        <w:rPr>
-          <w:rStyle w:val="VerbatimChar"/>
-        </w:rPr>
-        <w:t xml:space="preserve">-to</w:t>
-      </w:r>
-      <w:r>
-        <w:t xml:space="preserve"> </w:t>
-      </w:r>
-      <w:r>
-        <w:rPr>
-          <w:rFonts w:hint="eastAsia"/>
-        </w:rPr>
-        <w:t xml:space="preserve">的</w:t>
-      </w:r>
-      <w:r>
-        <w:t xml:space="preserve"> </w:t>
-      </w:r>
-      <w:r>
-        <w:rPr>
-          <w:rStyle w:val="VerbatimChar"/>
-        </w:rPr>
-        <w:t xml:space="preserve">set_max_delay / set_min_delay</w:t>
-      </w:r>
-      <w:r>
-        <w:t xml:space="preserve"> </w:t>
-      </w:r>
-      <w:r>
-        <w:rPr>
-          <w:rFonts w:hint="eastAsia"/>
-        </w:rPr>
-        <w:t xml:space="preserve">不参与</w:t>
-      </w:r>
-      <w:r>
-        <w:t xml:space="preserve"> Stage 2 </w:t>
-      </w:r>
-      <w:r>
-        <w:rPr>
-          <w:rFonts w:hint="eastAsia"/>
-        </w:rPr>
-        <w:t xml:space="preserve">合并，进入</w:t>
-      </w:r>
-      <w:r>
-        <w:t xml:space="preserve"> </w:t>
-      </w:r>
-      <w:r>
-        <w:t xml:space="preserve">review。</w:t>
+        <w:t>有 -from、没有 -to 的 set_max_delay / set_min_delay 记录为 open_to。有 -through 时从最后一级 -through collection 开始推导；没有 -through 时从 -from 开始。</w:t>
+        <w:br/>
+        <w:t>Stage 2 使用 PT all_fanout -flat -endpoints_only 枚举合法 endpoint。top endpoint 位于已暴露 harden 内时，必须使用非 flat all_fanin 恢复唯一 harden input boundary，再进入 E2E 递归累加。harden open_to 只接受本 harden 内 endpoint 或本 harden output boundary。</w:t>
+        <w:br/>
+        <w:t>推导为空、endpoint 超过 -max_endpoints、boundary 为空或不唯一时，原命令不 consume 并进入 review。</w:t>
       </w:r>
     </w:p>
     <w:bookmarkEnd w:id="25"/>
@@ -11004,626 +9932,43 @@
         <w:pStyle w:val="SourceCode"/>
       </w:pPr>
       <w:r>
-        <w:rPr>
-          <w:rStyle w:val="VerbatimChar"/>
-        </w:rPr>
-        <w:t xml:space="preserve">1. top delay </w:t>
-      </w:r>
-      <w:r>
-        <w:rPr>
-          <w:rStyle w:val="VerbatimChar"/>
-          <w:rFonts w:hint="eastAsia"/>
-        </w:rPr>
-        <w:t xml:space="preserve">没有</w:t>
-      </w:r>
-      <w:r>
-        <w:rPr>
-          <w:rStyle w:val="VerbatimChar"/>
-        </w:rPr>
-        <w:t xml:space="preserve"> -to。</w:t>
-      </w:r>
-      <w:r>
-        <w:br/>
-      </w:r>
-      <w:r>
-        <w:rPr>
-          <w:rStyle w:val="VerbatimChar"/>
-        </w:rPr>
-        <w:t xml:space="preserve">2. harden delay </w:t>
-      </w:r>
-      <w:r>
-        <w:rPr>
-          <w:rStyle w:val="VerbatimChar"/>
-          <w:rFonts w:hint="eastAsia"/>
-        </w:rPr>
-        <w:t xml:space="preserve">没有</w:t>
-      </w:r>
-      <w:r>
-        <w:rPr>
-          <w:rStyle w:val="VerbatimChar"/>
-        </w:rPr>
-        <w:t xml:space="preserve"> -to。</w:t>
-      </w:r>
-      <w:r>
-        <w:br/>
-      </w:r>
-      <w:r>
-        <w:rPr>
-          <w:rStyle w:val="VerbatimChar"/>
-        </w:rPr>
-        <w:t xml:space="preserve">3. max/min </w:t>
-      </w:r>
-      <w:r>
-        <w:rPr>
-          <w:rStyle w:val="VerbatimChar"/>
-          <w:rFonts w:hint="eastAsia"/>
-        </w:rPr>
-        <w:t xml:space="preserve">类型不一致。</w:t>
-      </w:r>
-      <w:r>
-        <w:br/>
-      </w:r>
-      <w:r>
-        <w:rPr>
-          <w:rStyle w:val="VerbatimChar"/>
-        </w:rPr>
-        <w:t xml:space="preserve">4. delay option </w:t>
-      </w:r>
-      <w:r>
-        <w:rPr>
-          <w:rStyle w:val="VerbatimChar"/>
-          <w:rFonts w:hint="eastAsia"/>
-        </w:rPr>
-        <w:t xml:space="preserve">不一致，例如</w:t>
-      </w:r>
-      <w:r>
-        <w:rPr>
-          <w:rStyle w:val="VerbatimChar"/>
-        </w:rPr>
-        <w:t xml:space="preserve"> -datapath_only </w:t>
-      </w:r>
-      <w:r>
-        <w:rPr>
-          <w:rStyle w:val="VerbatimChar"/>
-          <w:rFonts w:hint="eastAsia"/>
-        </w:rPr>
-        <w:t xml:space="preserve">不一致。</w:t>
-      </w:r>
-      <w:r>
-        <w:br/>
-      </w:r>
-      <w:r>
-        <w:rPr>
-          <w:rStyle w:val="VerbatimChar"/>
-        </w:rPr>
-        <w:t xml:space="preserve">5. harden open_from endpoint </w:t>
-      </w:r>
-      <w:r>
-        <w:rPr>
-          <w:rStyle w:val="VerbatimChar"/>
-          <w:rFonts w:hint="eastAsia"/>
-        </w:rPr>
-        <w:t xml:space="preserve">找不到</w:t>
-      </w:r>
-      <w:r>
-        <w:rPr>
-          <w:rStyle w:val="VerbatimChar"/>
-        </w:rPr>
-        <w:t xml:space="preserve"> boundary </w:t>
-      </w:r>
-      <w:r>
-        <w:rPr>
-          <w:rStyle w:val="VerbatimChar"/>
-          <w:rFonts w:hint="eastAsia"/>
-        </w:rPr>
-        <w:t xml:space="preserve">input（B_set</w:t>
-      </w:r>
-      <w:r>
-        <w:rPr>
-          <w:rStyle w:val="VerbatimChar"/>
-        </w:rPr>
-        <w:t xml:space="preserve"> </w:t>
-      </w:r>
-      <w:r>
-        <w:rPr>
-          <w:rStyle w:val="VerbatimChar"/>
-          <w:rFonts w:hint="eastAsia"/>
-        </w:rPr>
-        <w:t xml:space="preserve">为空）。</w:t>
-      </w:r>
-      <w:r>
-        <w:br/>
-      </w:r>
-      <w:r>
-        <w:rPr>
-          <w:rStyle w:val="VerbatimChar"/>
-        </w:rPr>
-        <w:t xml:space="preserve">6. harden open_from endpoint </w:t>
-      </w:r>
-      <w:r>
-        <w:rPr>
-          <w:rStyle w:val="VerbatimChar"/>
-          <w:rFonts w:hint="eastAsia"/>
-        </w:rPr>
-        <w:t xml:space="preserve">有多个</w:t>
-      </w:r>
-      <w:r>
-        <w:rPr>
-          <w:rStyle w:val="VerbatimChar"/>
-        </w:rPr>
-        <w:t xml:space="preserve"> boundary </w:t>
-      </w:r>
-      <w:r>
-        <w:rPr>
-          <w:rStyle w:val="VerbatimChar"/>
-          <w:rFonts w:hint="eastAsia"/>
-        </w:rPr>
-        <w:t xml:space="preserve">input，top</w:t>
-      </w:r>
-      <w:r>
-        <w:rPr>
-          <w:rStyle w:val="VerbatimChar"/>
-        </w:rPr>
-        <w:t xml:space="preserve"> delay </w:t>
-      </w:r>
-      <w:r>
-        <w:rPr>
-          <w:rStyle w:val="VerbatimChar"/>
-          <w:rFonts w:hint="eastAsia"/>
-        </w:rPr>
-        <w:t xml:space="preserve">无法</w:t>
-      </w:r>
-      <w:r>
-        <w:br/>
-      </w:r>
-      <w:r>
-        <w:rPr>
-          <w:rStyle w:val="VerbatimChar"/>
-        </w:rPr>
-        <w:t xml:space="preserve">   </w:t>
-      </w:r>
-      <w:r>
-        <w:rPr>
-          <w:rStyle w:val="VerbatimChar"/>
-          <w:rFonts w:hint="eastAsia"/>
-        </w:rPr>
-        <w:t xml:space="preserve">逐一匹配，且</w:t>
-      </w:r>
-      <w:r>
-        <w:rPr>
-          <w:rStyle w:val="VerbatimChar"/>
-        </w:rPr>
-        <w:t xml:space="preserve"> -partial_merge_policy = review。</w:t>
-      </w:r>
-      <w:r>
-        <w:br/>
-      </w:r>
-      <w:r>
-        <w:rPr>
-          <w:rStyle w:val="VerbatimChar"/>
-        </w:rPr>
-        <w:t xml:space="preserve">7. top open_from </w:t>
-      </w:r>
-      <w:r>
-        <w:rPr>
-          <w:rStyle w:val="VerbatimChar"/>
-          <w:rFonts w:hint="eastAsia"/>
-        </w:rPr>
-        <w:t xml:space="preserve">需要生成</w:t>
-      </w:r>
-      <w:r>
-        <w:rPr>
-          <w:rStyle w:val="VerbatimChar"/>
-        </w:rPr>
-        <w:t xml:space="preserve"> </w:t>
-      </w:r>
-      <w:r>
-        <w:rPr>
-          <w:rStyle w:val="VerbatimChar"/>
-          <w:rFonts w:hint="eastAsia"/>
-        </w:rPr>
-        <w:t xml:space="preserve">-through，但项目禁用</w:t>
-      </w:r>
-      <w:r>
-        <w:rPr>
-          <w:rStyle w:val="VerbatimChar"/>
-        </w:rPr>
-        <w:t xml:space="preserve"> -through。</w:t>
-      </w:r>
-      <w:r>
-        <w:br/>
-      </w:r>
-      <w:r>
-        <w:rPr>
-          <w:rStyle w:val="VerbatimChar"/>
-        </w:rPr>
-        <w:t xml:space="preserve">8. object collection </w:t>
-      </w:r>
-      <w:r>
-        <w:rPr>
-          <w:rStyle w:val="VerbatimChar"/>
-          <w:rFonts w:hint="eastAsia"/>
-        </w:rPr>
-        <w:t xml:space="preserve">为空。</w:t>
-      </w:r>
-      <w:r>
-        <w:br/>
-      </w:r>
-      <w:r>
-        <w:rPr>
-          <w:rStyle w:val="VerbatimChar"/>
-        </w:rPr>
-        <w:t xml:space="preserve">9. object </w:t>
-      </w:r>
-      <w:r>
-        <w:rPr>
-          <w:rStyle w:val="VerbatimChar"/>
-          <w:rFonts w:hint="eastAsia"/>
-        </w:rPr>
-        <w:t xml:space="preserve">类型未知，或对象为</w:t>
-      </w:r>
-      <w:r>
-        <w:rPr>
-          <w:rStyle w:val="VerbatimChar"/>
-        </w:rPr>
-        <w:t xml:space="preserve"> </w:t>
-      </w:r>
-      <w:r>
-        <w:rPr>
-          <w:rStyle w:val="VerbatimChar"/>
-          <w:rFonts w:hint="eastAsia"/>
-        </w:rPr>
-        <w:t xml:space="preserve">clock（[get_clocks</w:t>
-      </w:r>
-      <w:r>
-        <w:rPr>
-          <w:rStyle w:val="VerbatimChar"/>
-        </w:rPr>
-        <w:t xml:space="preserve"> </w:t>
-      </w:r>
-      <w:r>
-        <w:rPr>
-          <w:rStyle w:val="VerbatimChar"/>
-          <w:rFonts w:hint="eastAsia"/>
-        </w:rPr>
-        <w:t xml:space="preserve">...]）。</w:t>
-      </w:r>
-      <w:r>
-        <w:br/>
-      </w:r>
-      <w:r>
-        <w:rPr>
-          <w:rStyle w:val="VerbatimChar"/>
-        </w:rPr>
-        <w:t xml:space="preserve">10. hierarchy path </w:t>
-      </w:r>
-      <w:r>
-        <w:rPr>
-          <w:rStyle w:val="VerbatimChar"/>
-          <w:rFonts w:hint="eastAsia"/>
-        </w:rPr>
-        <w:t xml:space="preserve">与当前</w:t>
-      </w:r>
-      <w:r>
-        <w:rPr>
-          <w:rStyle w:val="VerbatimChar"/>
-        </w:rPr>
-        <w:t xml:space="preserve"> PT database </w:t>
-      </w:r>
-      <w:r>
-        <w:rPr>
-          <w:rStyle w:val="VerbatimChar"/>
-          <w:rFonts w:hint="eastAsia"/>
-        </w:rPr>
-        <w:t xml:space="preserve">不一致。</w:t>
-      </w:r>
-      <w:r>
-        <w:br/>
-      </w:r>
-      <w:r>
-        <w:rPr>
-          <w:rStyle w:val="VerbatimChar"/>
-        </w:rPr>
-        <w:t xml:space="preserve">11. harden instance </w:t>
-      </w:r>
-      <w:r>
-        <w:rPr>
-          <w:rStyle w:val="VerbatimChar"/>
-          <w:rFonts w:hint="eastAsia"/>
-        </w:rPr>
-        <w:t xml:space="preserve">不存在或未</w:t>
-      </w:r>
-      <w:r>
-        <w:rPr>
-          <w:rStyle w:val="VerbatimChar"/>
-        </w:rPr>
-        <w:t xml:space="preserve"> link。</w:t>
-      </w:r>
-      <w:r>
-        <w:br/>
-      </w:r>
-      <w:r>
-        <w:rPr>
-          <w:rStyle w:val="VerbatimChar"/>
-        </w:rPr>
-        <w:t xml:space="preserve">12. harden flatten netlist </w:t>
-      </w:r>
-      <w:r>
-        <w:rPr>
-          <w:rStyle w:val="VerbatimChar"/>
-          <w:rFonts w:hint="eastAsia"/>
-        </w:rPr>
-        <w:t xml:space="preserve">未读入，内部</w:t>
-      </w:r>
-      <w:r>
-        <w:rPr>
-          <w:rStyle w:val="VerbatimChar"/>
-        </w:rPr>
-        <w:t xml:space="preserve"> endpoint </w:t>
-      </w:r>
-      <w:r>
-        <w:rPr>
-          <w:rStyle w:val="VerbatimChar"/>
-          <w:rFonts w:hint="eastAsia"/>
-        </w:rPr>
-        <w:t xml:space="preserve">不可见。</w:t>
-      </w:r>
-      <w:r>
-        <w:br/>
-      </w:r>
-      <w:r>
-        <w:rPr>
-          <w:rStyle w:val="VerbatimChar"/>
-        </w:rPr>
-        <w:t xml:space="preserve">13. boundary pin </w:t>
-      </w:r>
-      <w:r>
-        <w:rPr>
-          <w:rStyle w:val="VerbatimChar"/>
-          <w:rFonts w:hint="eastAsia"/>
-        </w:rPr>
-        <w:t xml:space="preserve">与</w:t>
-      </w:r>
-      <w:r>
-        <w:rPr>
-          <w:rStyle w:val="VerbatimChar"/>
-        </w:rPr>
-        <w:t xml:space="preserve"> internal endpoint </w:t>
-      </w:r>
-      <w:r>
-        <w:rPr>
-          <w:rStyle w:val="VerbatimChar"/>
-          <w:rFonts w:hint="eastAsia"/>
-        </w:rPr>
-        <w:t xml:space="preserve">不属于同一</w:t>
-      </w:r>
-      <w:r>
-        <w:rPr>
-          <w:rStyle w:val="VerbatimChar"/>
-        </w:rPr>
-        <w:t xml:space="preserve"> harden instance。</w:t>
-      </w:r>
-      <w:r>
-        <w:br/>
-      </w:r>
-      <w:r>
-        <w:rPr>
-          <w:rStyle w:val="VerbatimChar"/>
-        </w:rPr>
-        <w:t xml:space="preserve">14. </w:t>
-      </w:r>
-      <w:r>
-        <w:rPr>
-          <w:rStyle w:val="VerbatimChar"/>
-          <w:rFonts w:hint="eastAsia"/>
-        </w:rPr>
-        <w:t xml:space="preserve">合并后约束被</w:t>
-      </w:r>
-      <w:r>
-        <w:rPr>
-          <w:rStyle w:val="VerbatimChar"/>
-        </w:rPr>
-        <w:t xml:space="preserve"> false_path / clock_group </w:t>
-      </w:r>
-      <w:r>
-        <w:rPr>
-          <w:rStyle w:val="VerbatimChar"/>
-          <w:rFonts w:hint="eastAsia"/>
-        </w:rPr>
-        <w:t xml:space="preserve">覆盖，导致无法命中预期</w:t>
-      </w:r>
-      <w:r>
-        <w:rPr>
-          <w:rStyle w:val="VerbatimChar"/>
-        </w:rPr>
-        <w:t xml:space="preserve"> path。</w:t>
-      </w:r>
-      <w:r>
-        <w:br/>
-      </w:r>
-      <w:r>
-        <w:rPr>
-          <w:rStyle w:val="VerbatimChar"/>
-        </w:rPr>
-        <w:t xml:space="preserve">15. </w:t>
-      </w:r>
-      <w:r>
-        <w:rPr>
-          <w:rStyle w:val="VerbatimChar"/>
-          <w:rFonts w:hint="eastAsia"/>
-        </w:rPr>
-        <w:t xml:space="preserve">段带</w:t>
-      </w:r>
-      <w:r>
-        <w:rPr>
-          <w:rStyle w:val="VerbatimChar"/>
-        </w:rPr>
-        <w:t xml:space="preserve"> edge-specific </w:t>
-      </w:r>
-      <w:r>
-        <w:rPr>
-          <w:rStyle w:val="VerbatimChar"/>
-          <w:rFonts w:hint="eastAsia"/>
-        </w:rPr>
-        <w:t xml:space="preserve">选项（-rise_from</w:t>
-      </w:r>
-      <w:r>
-        <w:rPr>
-          <w:rStyle w:val="VerbatimChar"/>
-        </w:rPr>
-        <w:t xml:space="preserve"> / -fall_to </w:t>
-      </w:r>
-      <w:r>
-        <w:rPr>
-          <w:rStyle w:val="VerbatimChar"/>
-          <w:rFonts w:hint="eastAsia"/>
-        </w:rPr>
-        <w:t xml:space="preserve">等，§13）。</w:t>
-      </w:r>
-      <w:r>
-        <w:br/>
-      </w:r>
-      <w:r>
-        <w:rPr>
-          <w:rStyle w:val="VerbatimChar"/>
-        </w:rPr>
-        <w:t xml:space="preserve">16. </w:t>
-      </w:r>
-      <w:r>
-        <w:rPr>
-          <w:rStyle w:val="VerbatimChar"/>
-          <w:rFonts w:hint="eastAsia"/>
-        </w:rPr>
-        <w:t xml:space="preserve">生成命令的</w:t>
-      </w:r>
-      <w:r>
-        <w:rPr>
-          <w:rStyle w:val="VerbatimChar"/>
-        </w:rPr>
-        <w:t xml:space="preserve"> -from/-to </w:t>
-      </w:r>
-      <w:r>
-        <w:rPr>
-          <w:rStyle w:val="VerbatimChar"/>
-          <w:rFonts w:hint="eastAsia"/>
-        </w:rPr>
-        <w:t xml:space="preserve">对象不是合法</w:t>
-      </w:r>
-      <w:r>
-        <w:rPr>
-          <w:rStyle w:val="VerbatimChar"/>
-        </w:rPr>
-        <w:t xml:space="preserve"> </w:t>
-      </w:r>
-      <w:r>
-        <w:rPr>
-          <w:rStyle w:val="VerbatimChar"/>
-          <w:rFonts w:hint="eastAsia"/>
-        </w:rPr>
-        <w:t xml:space="preserve">startpoint/endpoint（§13.1）。</w:t>
-      </w:r>
-      <w:r>
-        <w:br/>
-      </w:r>
-      <w:r>
-        <w:rPr>
-          <w:rStyle w:val="VerbatimChar"/>
-        </w:rPr>
-        <w:t xml:space="preserve">17. delay candidate </w:t>
-      </w:r>
-      <w:r>
-        <w:rPr>
-          <w:rStyle w:val="VerbatimChar"/>
-          <w:rFonts w:hint="eastAsia"/>
-        </w:rPr>
-        <w:t xml:space="preserve">标记</w:t>
-      </w:r>
-      <w:r>
-        <w:rPr>
-          <w:rStyle w:val="VerbatimChar"/>
-        </w:rPr>
-        <w:t xml:space="preserve"> input_delay_overlap = </w:t>
-      </w:r>
-      <w:r>
-        <w:rPr>
-          <w:rStyle w:val="VerbatimChar"/>
-          <w:rFonts w:hint="eastAsia"/>
-        </w:rPr>
-        <w:t xml:space="preserve">yes（§17.1）。</w:t>
-      </w:r>
-      <w:r>
-        <w:br/>
-      </w:r>
-      <w:r>
-        <w:rPr>
-          <w:rStyle w:val="VerbatimChar"/>
-        </w:rPr>
-        <w:t xml:space="preserve">18. </w:t>
-      </w:r>
-      <w:r>
-        <w:rPr>
-          <w:rStyle w:val="VerbatimChar"/>
-          <w:rFonts w:hint="eastAsia"/>
-        </w:rPr>
-        <w:t xml:space="preserve">多跳链场景（§9.4，MULTI_HOP_NOT_SUPPORTED）。</w:t>
-      </w:r>
-      <w:r>
-        <w:br/>
-      </w:r>
-      <w:r>
-        <w:rPr>
-          <w:rStyle w:val="VerbatimChar"/>
-        </w:rPr>
-        <w:t xml:space="preserve">19. </w:t>
-      </w:r>
-      <w:r>
-        <w:rPr>
-          <w:rStyle w:val="VerbatimChar"/>
-          <w:rFonts w:hint="eastAsia"/>
-        </w:rPr>
-        <w:t xml:space="preserve">枚举展开对象数量超过</w:t>
-      </w:r>
-      <w:r>
-        <w:rPr>
-          <w:rStyle w:val="VerbatimChar"/>
-        </w:rPr>
-        <w:t xml:space="preserve"> </w:t>
-      </w:r>
-      <w:r>
-        <w:rPr>
-          <w:rStyle w:val="VerbatimChar"/>
-          <w:rFonts w:hint="eastAsia"/>
-        </w:rPr>
-        <w:t xml:space="preserve">-max_enum_objects（§5）。</w:t>
-      </w:r>
-      <w:r>
-        <w:br/>
-      </w:r>
-      <w:r>
-        <w:rPr>
-          <w:rStyle w:val="VerbatimChar"/>
-        </w:rPr>
-        <w:t xml:space="preserve">20. delay </w:t>
-      </w:r>
-      <w:r>
-        <w:rPr>
-          <w:rStyle w:val="VerbatimChar"/>
-          <w:rFonts w:hint="eastAsia"/>
-        </w:rPr>
-        <w:t xml:space="preserve">命令引用文件内</w:t>
-      </w:r>
-      <w:r>
-        <w:rPr>
-          <w:rStyle w:val="VerbatimChar"/>
-        </w:rPr>
-        <w:t xml:space="preserve"> Tcl </w:t>
-      </w:r>
-      <w:r>
-        <w:rPr>
-          <w:rStyle w:val="VerbatimChar"/>
-          <w:rFonts w:hint="eastAsia"/>
-        </w:rPr>
-        <w:t xml:space="preserve">变量，无法静态解析（§12）。</w:t>
+        <w:t>1. delay 同时缺少 -from 和 -to。</w:t>
+        <w:br/>
+        <w:t>2. open_to 无法推导 endpoint，或 endpoint 数量超过 -max_endpoints。</w:t>
+        <w:br/>
+        <w:t>3. top open_to endpoint 位于 harden 内，但无法恢复唯一 input boundary。</w:t>
+        <w:br/>
+        <w:t>4. max/min 类型不一致。</w:t>
+        <w:br/>
+        <w:t>5. delay option 不一致，例如只有部分 segment 带 -ignore_clock_latency。</w:t>
+        <w:br/>
+        <w:t>6. harden open_from endpoint 找不到 boundary input（B_set 为空）。</w:t>
+        <w:br/>
+        <w:t>7. harden open_from endpoint 有多个 boundary input，top delay 无法逐一匹配，且 partial policy 为 review。</w:t>
+        <w:br/>
+        <w:t>8. object collection 为空。</w:t>
+        <w:br/>
+        <w:t>9. object 类型未知，或对象为 clock（[get_clocks ...]）。</w:t>
+        <w:br/>
+        <w:t>10. hierarchy path 与当前 PT database 不一致。</w:t>
+        <w:br/>
+        <w:t>11. harden instance 不存在、未 link，或 harden flatten netlist 未读入。</w:t>
+        <w:br/>
+        <w:t>12. boundary pin 与 internal endpoint 不属于同一 harden instance。</w:t>
+        <w:br/>
+        <w:t>13. 合并后约束被 false_path / clock_group 覆盖，无法命中预期 path。</w:t>
+        <w:br/>
+        <w:t>14. 段带 edge-specific 选项（-rise_from / -fall_to 等）。</w:t>
+        <w:br/>
+        <w:t>15. 生成命令的 -from/-to 不是合法 startpoint/endpoint。</w:t>
+        <w:br/>
+        <w:t>16. delay candidate 标记 input_delay_overlap = yes。</w:t>
+        <w:br/>
+        <w:t>17. 递归连接无法由 PT 证明，或超过 MAX_CHAIN_DEPTH。</w:t>
+        <w:br/>
+        <w:t>18. 枚举展开对象数量超过安全上限。</w:t>
+        <w:br/>
+        <w:t>19. delay 命令引用文件内 Tcl 变量，无法静态解析。</w:t>
       </w:r>
     </w:p>
     <w:p>
@@ -14628,6 +12973,34 @@
     </w:p>
     <w:bookmarkEnd w:id="49"/>
     <w:bookmarkEnd w:id="50"/>
+    <w:p>
+      <w:pPr>
+        <w:pStyle w:val="Heading2"/>
+      </w:pPr>
+      <w:r>
+        <w:t>25. open_to 覆盖完整性规则</w:t>
+      </w:r>
+    </w:p>
+    <w:p>
+      <w:pPr>
+        <w:pStyle w:val="BodyText"/>
+      </w:pPr>
+      <w:r>
+        <w:t>1. Stage 2 生成的 E2E delay 必须同时包含显式 -from 和 -to；-through 可保留用于区分路径。</w:t>
+        <w:br/>
+        <w:t>2. -through [list A B] 表示同一 through stage 的 alternatives，必须原组保留；-through A -through B 才表示两个连续 stage。</w:t>
+        <w:br/>
+        <w:t>3. 多 from 与多 endpoint 按 SDC 语义展开。相同 boundary 下的多个 endpoint 都必须被统计，最终语义相同的 SDC 只输出一次。</w:t>
+        <w:br/>
+        <w:t>4. replace 模式只有在 endpoint 已生成 E2E 或被改写为显式 residual 时才允许移除对应原始分支。无法完整推导时保留原命令。</w:t>
+        <w:br/>
+        <w:t>5. top/harden 的 passthrough open_to 若没有参与 merge，可以保留原生缺 -to 写法。</w:t>
+        <w:br/>
+        <w:t>6. 真实 segment 的 flags 必须一致；synthetic missing-SDC zero stage 不参与 flags 一致性比较。</w:t>
+        <w:br/>
+        <w:t>7. 失败原因使用 OPEN_TO_ENDPOINT_NOT_INFERRED、TOO_MANY_OPEN_TO_ENDPOINTS、OPEN_TO_BOUNDARY_NOT_INFERRED、OPEN_TO_MULTIPLE_BOUNDARIES 或 DELAY_OPTION_MISMATCH。</w:t>
+      </w:r>
+    </w:p>
     <w:sectPr>
       <w:footnotePr>
         <w:numRestart w:val="eachSect"/>

</xml_diff>

<commit_message>
Optimize Stage2 open-to list processing
</commit_message>
<xml_diff>
--- a/soc_sdc_work/Flatten SDC脚本/STA Flatten 2 Set Delay Merge PrimeTime脚本/Stage 2 Integration E2E Delay Merge Proc 规则.docx
+++ b/soc_sdc_work/Flatten SDC脚本/STA Flatten 2 Set Delay Merge PrimeTime脚本/Stage 2 Integration E2E Delay Merge Proc 规则.docx
@@ -8,7 +8,7 @@
         <w:pStyle w:val="Heading1"/>
       </w:pPr>
       <w:r>
-        <w:t>Stage 2：Integration E2E Delay Merge Proc 规则 v0.4</w:t>
+        <w:t>Stage 2：Integration E2E Delay Merge Proc 规则 v0.5</w:t>
       </w:r>
     </w:p>
     <w:bookmarkStart w:id="9" w:name="修订记录v0.2-v0.3"/>
@@ -17,7 +17,7 @@
         <w:pStyle w:val="Heading2"/>
       </w:pPr>
       <w:r>
-        <w:t>修订记录（v0.3 → v0.4）</w:t>
+        <w:t>修订记录（v0.4 -&gt; v0.5）</w:t>
       </w:r>
     </w:p>
     <w:p>
@@ -25,7 +25,15 @@
         <w:pStyle w:val="FirstParagraph"/>
       </w:pPr>
       <w:r>
-        <w:t>基于 v0.9.0 实现补充 open_to、递归链和覆盖完整性规则：</w:t>
+        <w:t>基于 v0.9.1 实现补充 open_to 大规模 list 性能优化：</w:t>
+        <w:br/>
+        <w:t>1. 对连续完整 bus 的 -from / -through list 做 PT 集合等价验证后压缩为 [*] selector。</w:t>
+        <w:br/>
+        <w:t>2. 按对象 class 批量查询 open_to fanout，并缓存同一次 build 内重复查询。</w:t>
+        <w:br/>
+        <w:t>3. PT getter 或 wildcard 等价验证失败时安全回退到精确成员和逐 seed 查询。</w:t>
+        <w:br/>
+        <w:t>4. harden immediate boundary 的 -from 保持逐成员匹配，确保跨层 consume 和残留重写语义不变。</w:t>
       </w:r>
     </w:p>
     <w:p>
@@ -11334,82 +11342,29 @@
         <w:pStyle w:val="SourceCode"/>
       </w:pPr>
       <w:r>
-        <w:rPr>
-          <w:rStyle w:val="VerbatimChar"/>
-        </w:rPr>
-        <w:t xml:space="preserve">-merge_mode replace</w:t>
-      </w:r>
-      <w:r>
-        <w:br/>
-      </w:r>
-      <w:r>
-        <w:rPr>
-          <w:rStyle w:val="VerbatimChar"/>
-        </w:rPr>
-        <w:t xml:space="preserve">-top_open_from_mode through</w:t>
-      </w:r>
-      <w:r>
-        <w:br/>
-      </w:r>
-      <w:r>
-        <w:rPr>
-          <w:rStyle w:val="VerbatimChar"/>
-        </w:rPr>
-        <w:t xml:space="preserve">-allow_through true</w:t>
-      </w:r>
-      <w:r>
-        <w:br/>
-      </w:r>
-      <w:r>
-        <w:rPr>
-          <w:rStyle w:val="VerbatimChar"/>
-        </w:rPr>
-        <w:t xml:space="preserve">-allow_collapse_single_boundary false</w:t>
-      </w:r>
-      <w:r>
-        <w:br/>
-      </w:r>
-      <w:r>
-        <w:rPr>
-          <w:rStyle w:val="VerbatimChar"/>
-        </w:rPr>
-        <w:t xml:space="preserve">-partial_merge_policy residual_through</w:t>
-      </w:r>
-      <w:r>
-        <w:br/>
-      </w:r>
-      <w:r>
-        <w:rPr>
-          <w:rStyle w:val="VerbatimChar"/>
-        </w:rPr>
-        <w:t xml:space="preserve">-unmatched_harden_policy review</w:t>
-      </w:r>
-      <w:r>
-        <w:br/>
-      </w:r>
-      <w:r>
-        <w:rPr>
-          <w:rStyle w:val="VerbatimChar"/>
-        </w:rPr>
-        <w:t xml:space="preserve">-max_endpoints 1000</w:t>
-      </w:r>
-      <w:r>
-        <w:br/>
-      </w:r>
-      <w:r>
-        <w:rPr>
-          <w:rStyle w:val="VerbatimChar"/>
-        </w:rPr>
-        <w:t xml:space="preserve">-max_enum_objects 64</w:t>
-      </w:r>
-      <w:r>
-        <w:br/>
-      </w:r>
-      <w:r>
-        <w:rPr>
-          <w:rStyle w:val="VerbatimChar"/>
-        </w:rPr>
-        <w:t xml:space="preserve">-check_units true</w:t>
+        <w:t>-merge_mode replace</w:t>
+        <w:br/>
+        <w:t>-top_open_from_mode through</w:t>
+        <w:br/>
+        <w:t>-allow_through true</w:t>
+        <w:br/>
+        <w:t>-allow_collapse_single_boundary false</w:t>
+        <w:br/>
+        <w:t>-partial_merge_policy residual_through</w:t>
+        <w:br/>
+        <w:t>-unmatched_harden_policy review</w:t>
+        <w:br/>
+        <w:t>-max_endpoints 1000</w:t>
+        <w:br/>
+        <w:t>-max_enum_objects 64</w:t>
+        <w:br/>
+        <w:t>-compact_bus true</w:t>
+        <w:br/>
+        <w:t>-compact_bus_min_members 4</w:t>
+        <w:br/>
+        <w:t>-batch_open_to_query true</w:t>
+        <w:br/>
+        <w:t>-check_units true</w:t>
       </w:r>
     </w:p>
     <w:p>
@@ -12999,6 +12954,94 @@
         <w:t>6. 真实 segment 的 flags 必须一致；synthetic missing-SDC zero stage 不参与 flags 一致性比较。</w:t>
         <w:br/>
         <w:t>7. 失败原因使用 OPEN_TO_ENDPOINT_NOT_INFERRED、TOO_MANY_OPEN_TO_ENDPOINTS、OPEN_TO_BOUNDARY_NOT_INFERRED、OPEN_TO_MULTIPLE_BOUNDARIES 或 DELAY_OPTION_MISMATCH。</w:t>
+      </w:r>
+    </w:p>
+    <w:p>
+      <w:pPr>
+        <w:pStyle w:val="Heading2"/>
+        <w:spacing w:after="120" w:line="259" w:lineRule="auto"/>
+        <w:jc w:val="left"/>
+      </w:pPr>
+      <w:r>
+        <w:t>26. open_to 大规模 list 性能优化（v0.9.1）</w:t>
+      </w:r>
+    </w:p>
+    <w:p>
+      <w:pPr>
+        <w:spacing w:after="120" w:line="259" w:lineRule="auto"/>
+        <w:jc w:val="left"/>
+      </w:pPr>
+      <w:r>
+        <w:t>当 top 或 harden delay 有 -from、可选 -through、缺少 -to 时，Stage 2 需要先由 PT 推导 endpoint。DC 产生的 list-to-list 约束可能包含大量连续 bus bit；如果逐 bit 调用 all_fanout，并在脚本中做 from x endpoint 展开，运行时间和中间对象数量会快速增长。v0.9.1 对这一场景做保守优化。</w:t>
+      </w:r>
+    </w:p>
+    <w:p>
+      <w:pPr>
+        <w:pStyle w:val="BodyText"/>
+        <w:spacing w:after="120" w:line="259" w:lineRule="auto"/>
+        <w:jc w:val="left"/>
+      </w:pPr>
+      <w:r>
+        <w:t>优化规则：</w:t>
+      </w:r>
+    </w:p>
+    <w:p>
+      <w:pPr>
+        <w:spacing w:after="120" w:line="259" w:lineRule="auto"/>
+        <w:jc w:val="left"/>
+      </w:pPr>
+      <w:r>
+        <w:t>1. 只处理 open_to 的 -from 和每一级 -through；有明确 -to 的普通 complete 规则不改变。</w:t>
+        <w:br/>
+        <w:t>2. 只有对象 class、PT direction、owner harden、bus basename 均相同，index 连续且无重复，并且成员数达到 compact_bus_min_members 时，才形成候选。</w:t>
+        <w:br/>
+        <w:t>3. 默认 selector 使用 [get_pins {bus[*]}] 或 [get_ports {bus[*]}]。脚本在当前 linked PT database 中查询 selector，并将实际 full_name 集合与原始成员集合排序去重后比较；集合不完全相等时禁止压缩。</w:t>
+        <w:br/>
+        <w:t>4. wildcard 多匹配、缺 bit、对象被优化掉、getter 不支持或查询异常均保留原始精确成员，不静默放宽约束。</w:t>
+        <w:br/>
+        <w:t>5. harden immediate boundary 的 -from 不压缩，以便每个 boundary 独立匹配 top segment，并正确决定 consume、residual 或 review。它们仍可进入批量 PT collection 查询。</w:t>
+        <w:br/>
+        <w:t>6. open_to seed 按 pin、port、cell、net class 分组，每组执行一次 all_fanout -flat -endpoints_only；harden open_to 的 full fanout 同样按组执行一次。批量 getter 失败或返回集合不完整时回退逐 seed 查询。</w:t>
+        <w:br/>
+        <w:t>7. bus 等价查询和 endpoint 推导在一次 build 内缓存，避免写 final SDC 时再次触发相同 PT 查询。</w:t>
+      </w:r>
+    </w:p>
+    <w:p>
+      <w:pPr>
+        <w:pStyle w:val="BodyText"/>
+        <w:spacing w:after="120" w:line="259" w:lineRule="auto"/>
+        <w:jc w:val="left"/>
+      </w:pPr>
+      <w:r>
+        <w:t>输出与 review：</w:t>
+      </w:r>
+    </w:p>
+    <w:p>
+      <w:pPr>
+        <w:spacing w:after="120" w:line="259" w:lineRule="auto"/>
+        <w:jc w:val="left"/>
+      </w:pPr>
+      <w:r>
+        <w:t>压缩只减少 Stage 2 内部的对象展开和重复 fanout 查询，不改变 PrimeTime 对有效路径的 collection 语义。生成 SDC 中可能出现静态 [*] selector，但它只在 PT 已证明与原成员集合完全一致时出现。integration_delay_merge.rpt 的 SUMMARY 会记录 compact_candidates、compact_applied、compact_members_saved、batch_groups、batch_endpoint_queries、batch_full_fanout_queries、batch_fallbacks、target_cache_hits 和 compact_cache_hits。</w:t>
+      </w:r>
+    </w:p>
+    <w:p>
+      <w:pPr>
+        <w:pStyle w:val="BodyText"/>
+        <w:spacing w:after="120" w:line="259" w:lineRule="auto"/>
+        <w:jc w:val="left"/>
+      </w:pPr>
+      <w:r>
+        <w:t>回归要求：</w:t>
+      </w:r>
+    </w:p>
+    <w:p>
+      <w:pPr>
+        <w:spacing w:after="120" w:line="259" w:lineRule="auto"/>
+        <w:jc w:val="left"/>
+      </w:pPr>
+      <w:r>
+        <w:t>至少覆盖完整连续 bus、缺 bit、wildcard 额外匹配、多个对象 class、harden boundary 批量 fanout，以及批量 getter 失败回退；回归应确认生成的 -from / -through / -to 集合和原始成员语义一致。</w:t>
       </w:r>
     </w:p>
     <w:sectPr>

</xml_diff>

<commit_message>
Optimize Stage2 repeated query and matching work
</commit_message>
<xml_diff>
--- a/soc_sdc_work/Flatten SDC脚本/STA Flatten 2 Set Delay Merge PrimeTime脚本/Stage 2 Integration E2E Delay Merge Proc 规则.docx
+++ b/soc_sdc_work/Flatten SDC脚本/STA Flatten 2 Set Delay Merge PrimeTime脚本/Stage 2 Integration E2E Delay Merge Proc 规则.docx
@@ -8,7 +8,7 @@
         <w:pStyle w:val="Heading1"/>
       </w:pPr>
       <w:r>
-        <w:t>Stage 2：Integration E2E Delay Merge Proc 规则 v0.5</w:t>
+        <w:t>Stage 2：Integration E2E Delay Merge Proc 规则 v0.9.2</w:t>
       </w:r>
     </w:p>
     <w:bookmarkStart w:id="9" w:name="修订记录v0.2-v0.3"/>
@@ -17,7 +17,7 @@
         <w:pStyle w:val="Heading2"/>
       </w:pPr>
       <w:r>
-        <w:t>修订记录（v0.4 -&gt; v0.5）</w:t>
+        <w:t>修订记录（v0.9.1 -&gt; v0.9.2）</w:t>
       </w:r>
     </w:p>
     <w:p>
@@ -25,15 +25,17 @@
         <w:pStyle w:val="FirstParagraph"/>
       </w:pPr>
       <w:r>
-        <w:t>基于 v0.9.1 实现补充 open_to 大规模 list 性能优化：</w:t>
-        <w:br/>
-        <w:t>1. 对连续完整 bus 的 -from / -through list 做 PT 集合等价验证后压缩为 [*] selector。</w:t>
-        <w:br/>
-        <w:t>2. 按对象 class 批量查询 open_to fanout，并缓存同一次 build 内重复查询。</w:t>
-        <w:br/>
-        <w:t>3. PT getter 或 wildcard 等价验证失败时安全回退到精确成员和逐 seed 查询。</w:t>
-        <w:br/>
-        <w:t>4. harden immediate boundary 的 -from 保持逐成员匹配，确保跨层 consume 和残留重写语义不变。</w:t>
+        <w:t>基于 v0.9.1 open_to 优化，v0.9.2 增加以下性能优化，且不改变 PT/SDC 语义：</w:t>
+        <w:br/>
+        <w:t>1. 对显式 pin/port/cell/net 对象按 class 分组，批量查询 direction metadata。</w:t>
+        <w:br/>
+        <w:t>2. 批量查询必须通过 PT 返回 full_name 集合与原始集合完全相等的校验；getter 不支持、命令报错、少返回或多返回时，自动回退逐对象查询。</w:t>
+        <w:br/>
+        <w:t>3. 缓存对象属性、owner harden、boundary/startpoint、missing-SDC fanin/fanout 推导结果；空结果也缓存，避免重复失败查询。</w:t>
+        <w:br/>
+        <w:t>4. 建立 top/chain/harden boundary 索引，并复用首次解析的 delay segment；未消费 delay 的 SDC 文件直接原样写出，索引异常时保留重新解析 fallback。</w:t>
+        <w:br/>
+        <w:t>5. report 和 terminal 输出性能统计，回归覆盖 33 个 mock-Tcl case。</w:t>
       </w:r>
     </w:p>
     <w:p>
@@ -11331,10 +11333,7 @@
         <w:pStyle w:val="FirstParagraph"/>
       </w:pPr>
       <w:r>
-        <w:rPr>
-          <w:rFonts w:hint="eastAsia"/>
-        </w:rPr>
-        <w:t xml:space="preserve">推荐默认：</w:t>
+        <w:t>推荐默认：</w:t>
       </w:r>
     </w:p>
     <w:p>
@@ -11344,9 +11343,9 @@
       <w:r>
         <w:t>-merge_mode replace</w:t>
         <w:br/>
-        <w:t>-top_open_from_mode through</w:t>
-        <w:br/>
-        <w:t>-allow_through true</w:t>
+        <w:t>-top_open_from_mode enumerate_static_startpoints</w:t>
+        <w:br/>
+        <w:t>-allow_through false</w:t>
         <w:br/>
         <w:t>-allow_collapse_single_boundary false</w:t>
         <w:br/>
@@ -11354,6 +11353,12 @@
         <w:br/>
         <w:t>-unmatched_harden_policy review</w:t>
         <w:br/>
+        <w:t>-top_port_boundary_map_mode connectivity</w:t>
+        <w:br/>
+        <w:t>-recursive_chain_mode auto</w:t>
+        <w:br/>
+        <w:t>-max_chain_depth 6</w:t>
+        <w:br/>
         <w:t>-max_endpoints 1000</w:t>
         <w:br/>
         <w:t>-max_enum_objects 64</w:t>
@@ -11364,7 +11369,9 @@
         <w:br/>
         <w:t>-batch_open_to_query true</w:t>
         <w:br/>
-        <w:t>-check_units true</w:t>
+        <w:t>-verbose_pt_query true</w:t>
+        <w:br/>
+        <w:t>-write_path_summary true</w:t>
       </w:r>
     </w:p>
     <w:p>
@@ -13042,6 +13049,86 @@
       </w:pPr>
       <w:r>
         <w:t>至少覆盖完整连续 bus、缺 bit、wildcard 额外匹配、多个对象 class、harden boundary 批量 fanout，以及批量 getter 失败回退；回归应确认生成的 -from / -through / -to 集合和原始成员语义一致。</w:t>
+      </w:r>
+    </w:p>
+    <w:p/>
+    <w:p>
+      <w:pPr>
+        <w:pStyle w:val="Heading2"/>
+      </w:pPr>
+      <w:r>
+        <w:t>27. v0.9.2 查询与重写性能优化规则</w:t>
+      </w:r>
+    </w:p>
+    <w:p>
+      <w:r>
+        <w:t>本节只约束查询实现方式，不改变 delay segment 的匹配、数值累加、consume、residual、review 或最终 SDC 生成规则。所有优化都必须保持原始 PT 对象集合和最终约束语义不变。</w:t>
+      </w:r>
+    </w:p>
+    <w:p>
+      <w:r>
+        <w:t>27.1 对象 metadata 批量查询</w:t>
+      </w:r>
+    </w:p>
+    <w:p>
+      <w:r>
+        <w:t>解析得到 direction 为空的静态对象后，脚本按 object class 分组。对 pin、port、cell、net 分别最多尝试一次 multi-pattern getter，并读取每个返回对象的 full_name 和 direction。批量结果只有同时满足以下条件才可使用：</w:t>
+      </w:r>
+    </w:p>
+    <w:p>
+      <w:r>
+        <w:t>1. PT getter 和 collection API 可用。</w:t>
+        <w:br/>
+        <w:t>2. 返回对象的 full_name 排序去重后与原始对象集合完全相等。</w:t>
+        <w:br/>
+        <w:t>3. 未发生命令异常，且每个原始对象都能得到对应 metadata。</w:t>
+        <w:br/>
+        <w:t>4. wildcard 或动态 collection 不进入批量 exact-set 路径。</w:t>
+      </w:r>
+    </w:p>
+    <w:p>
+      <w:r>
+        <w:t>任一条件不满足，必须记录 batch fallback，并回退到原来的逐对象 get_attribute 查询。禁止因为批量查询少返回对象而静默删掉对象、扩大 wildcard 或改变 from/through/to 集合。批量优化只减少 query 次数，不允许改变约束展开结果。</w:t>
+      </w:r>
+    </w:p>
+    <w:p>
+      <w:r>
+        <w:t>27.2 查询缓存与空结果</w:t>
+      </w:r>
+    </w:p>
+    <w:p>
+      <w:r>
+        <w:t>同一次 build 内，以下结果按完整 scope key 缓存：对象属性、对象所属 harden、endpoint 对应 boundary input、boundary 对应 startpoint、missing harden fanout target、missing top fanout target。空 collection 和查询失败结果也必须缓存；缓存命中不得跳过原有 review/failure 状态的生成。reset_state 时所有缓存必须清空，不能跨 build 复用旧 PT design 的对象。</w:t>
+      </w:r>
+    </w:p>
+    <w:p>
+      <w:r>
+        <w:t>27.3 Segment 索引与 final SDC 重写</w:t>
+      </w:r>
+    </w:p>
+    <w:p>
+      <w:r>
+        <w:t>完成 segment classification 后，脚本建立按 delay type、boundary object、owner 和 source scope 的索引，用于替代重复的全量 segment 扫描。索引只保存原 segment 及其原始顺序，不得合并或重排具有不同 command_id 的约束。</w:t>
+      </w:r>
+    </w:p>
+    <w:p>
+      <w:r>
+        <w:t>final flatten SDC 重写时优先复用第一次解析的 source_file/line_no/original_text 索引。某个 source SDC 没有 consumed delay segment 时，直接原样写出其文本；如果索引条目意外缺失，必须回退重新解析，不能漏写非 delay 约束。</w:t>
+      </w:r>
+    </w:p>
+    <w:p>
+      <w:r>
+        <w:t>27.4 性能统计与验证</w:t>
+      </w:r>
+    </w:p>
+    <w:p>
+      <w:r>
+        <w:t>integration_delay_merge.rpt 的 [SUMMARY] 和 terminal 的 Stage2 performance statistics 至少应能观察 metadata_batch_queries、metadata_batch_fallbacks、metadata_individual_queries、各类 cache hits、segment_index_lookups、final_rewrite_index_hits、final_rewrite_skipped_files 和 parsed_segment_reuse_hits。</w:t>
+      </w:r>
+    </w:p>
+    <w:p>
+      <w:r>
+        <w:t>回归必须确认：批量 metadata 返回集合完全相等时所有约束仍生成；批量 getter 失败或集合不匹配时逐对象 fallback 不丢对象；缓存只减少重复 PT query；final SDC 中未消费的静态约束和注释保持原样。无 PrimeTime license 时的 mock-Tcl regression 只能验证 解析和静态输出，正式交付前仍需在真实 linked design 中执行 PT post-check。</w:t>
       </w:r>
     </w:p>
     <w:sectPr>

</xml_diff>

<commit_message>
Optimize Stage2 list and summary processing v0.9.3
</commit_message>
<xml_diff>
--- a/soc_sdc_work/Flatten SDC脚本/STA Flatten 2 Set Delay Merge PrimeTime脚本/Stage 2 Integration E2E Delay Merge Proc 规则.docx
+++ b/soc_sdc_work/Flatten SDC脚本/STA Flatten 2 Set Delay Merge PrimeTime脚本/Stage 2 Integration E2E Delay Merge Proc 规则.docx
@@ -8,7 +8,33 @@
         <w:pStyle w:val="Heading1"/>
       </w:pPr>
       <w:r>
-        <w:t>Stage 2：Integration E2E Delay Merge Proc 规则 v0.9.2</w:t>
+        <w:t>Stage 2：Integration E2E Delay Merge Proc 规则 v0.9.3</w:t>
+      </w:r>
+    </w:p>
+    <w:p>
+      <w:pPr>
+        <w:pStyle w:val="Heading2"/>
+      </w:pPr>
+      <w:r>
+        <w:t>修订记录（v0.9.2 -&gt; v0.9.3）</w:t>
+      </w:r>
+    </w:p>
+    <w:p>
+      <w:pPr>
+        <w:pStyle w:val="FirstParagraph"/>
+      </w:pPr>
+      <w:r>
+        <w:t>v0.9.3 在不改变 PT API、SDC collection 语义、约束顺序和输出顺序的前提下，进一步优化大规模 list 与 summary 处理：</w:t>
+        <w:br/>
+        <w:t>1. 长 list 构造由循环 concat 改为增量 lappend，覆盖 object list、through group、bus compact fallback、top boundary mapping 和 open_to target 汇总。</w:t>
+        <w:br/>
+        <w:t>2. final SDC partial rewrite 使用 segment signature-count hash；重复 signature 仍按计数逐条消费，并复用递归路径已计算的 signature。</w:t>
+        <w:br/>
+        <w:t>3. path summary 一次遍历建立 sheet、status、missing-SDC、最大列数和 max-delay 使用统计；CSV 每行 key/value 只解析一次。</w:t>
+        <w:br/>
+        <w:t>4. 新增 final_rewrite_signature_lookups 性能统计；metadata 回归由 8 个显式对象扩大到 64 个，并校验 top/harden CSV 行数。</w:t>
+        <w:br/>
+        <w:t>5. 固定 2048-object mock 基准保持 2048 条 E2E 约束和两张各 2048 行 CSV，耗时从 6.808s 降至 6.309s，约减少 7.3%；该数字不代表真实 PrimeTime database 查询加速比例。</w:t>
       </w:r>
     </w:p>
     <w:bookmarkStart w:id="9" w:name="修订记录v0.2-v0.3"/>
@@ -13129,6 +13155,68 @@
     <w:p>
       <w:r>
         <w:t>回归必须确认：批量 metadata 返回集合完全相等时所有约束仍生成；批量 getter 失败或集合不匹配时逐对象 fallback 不丢对象；缓存只减少重复 PT query；final SDC 中未消费的静态约束和注释保持原样。无 PrimeTime license 时的 mock-Tcl regression 只能验证 解析和静态输出，正式交付前仍需在真实 linked design 中执行 PT post-check。</w:t>
+      </w:r>
+    </w:p>
+    <w:p>
+      <w:pPr>
+        <w:pStyle w:val="Heading2"/>
+      </w:pPr>
+      <w:r>
+        <w:t>28. v0.9.3 Tcl 容器与汇总性能优化规则</w:t>
+      </w:r>
+    </w:p>
+    <w:p>
+      <w:pPr/>
+      <w:r>
+        <w:t>本节只优化 Tcl 内部 list、hash 和 CSV summary 的构造方式，不新增 PrimeTime 命令，不改变 delay segment 匹配、数值累加、consume、residual、review、对象顺序或最终 SDC 输出顺序。</w:t>
+      </w:r>
+    </w:p>
+    <w:p>
+      <w:pPr/>
+      <w:r>
+        <w:t>28.1 增量 list 构造</w:t>
+      </w:r>
+    </w:p>
+    <w:p>
+      <w:pPr/>
+      <w:r>
+        <w:t>在循环内累积 object record、through record、bus fallback member、top boundary mapping 结果和 open_to target 时，应使用 lappend 逐项追加，避免 concat 在成员增长过程中反复复制完整 list。fallback 分支必须保持原成员顺序，禁止因性能优化而排序、去重或改变 through group 边界。</w:t>
+      </w:r>
+    </w:p>
+    <w:p>
+      <w:pPr/>
+      <w:r>
+        <w:t>28.2 Partial rewrite signature-count hash</w:t>
+      </w:r>
+    </w:p>
+    <w:p>
+      <w:pPr/>
+      <w:r>
+        <w:t>final flatten SDC 对多 object 原命令执行 partial rewrite 时，应先按 segment_signature 建立 consumed count hash，再按原 expanded segment 顺序递减计数。相同 signature 出现多次时必须逐条消费，不能只用布尔集合；未消费 segment 的输出顺序必须与原展开顺序一致。递归路径已经计算的 path signature 应直接复用，避免同一路径重复序列化。</w:t>
+      </w:r>
+    </w:p>
+    <w:p>
+      <w:pPr/>
+      <w:r>
+        <w:t>28.3 Path summary 单遍索引</w:t>
+      </w:r>
+    </w:p>
+    <w:p>
+      <w:pPr/>
+      <w:r>
+        <w:t>write_path_summary 应在一次遍历中建立 rows_by_sheet、status count、missing-SDC stage count、最大 through/path 列数，并一次性统计各 sheet 的 max_delay total/used。写单行 CSV 时，每个 item 的 key/value list 只转换一次；预计算结果只用于减少重复扫描，不得改变 sheet 顺序、CSV 行顺序、列名或 00_index.csv 的统计口径。</w:t>
+      </w:r>
+    </w:p>
+    <w:p>
+      <w:pPr/>
+      <w:r>
+        <w:t>28.4 性能统计与回归门槛</w:t>
+      </w:r>
+    </w:p>
+    <w:p>
+      <w:pPr/>
+      <w:r>
+        <w:t>report 与 terminal 应输出 final_rewrite_signature_lookups，便于确认 hash 匹配路径已被使用。metadata 批量回归至少覆盖 64 个显式对象并核对生成约束数及 top/harden CSV 行数；固定 2048-object mock benchmark 应保持 2048 条 E2E 约束和两张各 2048 行 CSV。mock benchmark 只验证 Tcl 处理成本和输出稳定性，真实 PT 性能与正确性仍由 linked design 内网测试确认。</w:t>
       </w:r>
     </w:p>
     <w:sectPr>

</xml_diff>

<commit_message>
Add live Stage2 diagnostics v0.9.4
</commit_message>
<xml_diff>
--- a/soc_sdc_work/Flatten SDC脚本/STA Flatten 2 Set Delay Merge PrimeTime脚本/Stage 2 Integration E2E Delay Merge Proc 规则.docx
+++ b/soc_sdc_work/Flatten SDC脚本/STA Flatten 2 Set Delay Merge PrimeTime脚本/Stage 2 Integration E2E Delay Merge Proc 规则.docx
@@ -8,7 +8,33 @@
         <w:pStyle w:val="Heading1"/>
       </w:pPr>
       <w:r>
-        <w:t>Stage 2：Integration E2E Delay Merge Proc 规则 v0.9.3</w:t>
+        <w:t>Stage 2：Integration E2E Delay Merge Proc 规则 v0.9.4</w:t>
+      </w:r>
+    </w:p>
+    <w:p>
+      <w:pPr>
+        <w:pStyle w:val="Heading2"/>
+      </w:pPr>
+      <w:r>
+        <w:t>修订记录（v0.9.3 -&gt; v0.9.4）</w:t>
+      </w:r>
+    </w:p>
+    <w:p>
+      <w:pPr>
+        <w:pStyle w:val="FirstParagraph"/>
+      </w:pPr>
+      <w:r>
+        <w:t>v0.9.4 增加长时间 PrimeTime 运行的实时诊断能力，不改变 delay merge、数值累加或 startpoint 合法性规则：</w:t>
+        <w:br/>
+        <w:t>1. 新增 STAGE2_TRACE_FILE / -out_trace_file，默认输出 $OUT_DIR/stage2_live.log。</w:t>
+        <w:br/>
+        <w:t>2. trace 文件在解析 SDC 前创建，每写一行立即 flush，可在运行中使用 tail -f 查看。</w:t>
+        <w:br/>
+        <w:t>3. 实时记录 build phase、PT query、review 和最终 generated/review 计数。</w:t>
+        <w:br/>
+        <w:t>4. INVALID_STARTPOINT 立即记录实际候选 from/to 的 class、full name、direction、owner，以及 path、top ID 和 harden ID。</w:t>
+        <w:br/>
+        <w:t>5. 新增 mock-Tcl 回归，确认非法 harden boundary from 的完整诊断被写入实时文件；回归总数增加到 34。</w:t>
       </w:r>
     </w:p>
     <w:p>
@@ -13217,6 +13243,68 @@
       <w:pPr/>
       <w:r>
         <w:t>report 与 terminal 应输出 final_rewrite_signature_lookups，便于确认 hash 匹配路径已被使用。metadata 批量回归至少覆盖 64 个显式对象并核对生成约束数及 top/harden CSV 行数；固定 2048-object mock benchmark 应保持 2048 条 E2E 约束和两张各 2048 行 CSV。mock benchmark 只验证 Tcl 处理成本和输出稳定性，真实 PT 性能与正确性仍由 linked design 内网测试确认。</w:t>
+      </w:r>
+    </w:p>
+    <w:p>
+      <w:pPr>
+        <w:pStyle w:val="Heading2"/>
+      </w:pPr>
+      <w:r>
+        <w:t>29. v0.9.4 实时运行诊断规则</w:t>
+      </w:r>
+    </w:p>
+    <w:p>
+      <w:pPr/>
+      <w:r>
+        <w:t>本节只增强长时间运行的可观察性，不允许因为诊断功能而改变 PT query 结果、delay path 匹配、consume/review 判定或最终 SDC。</w:t>
+      </w:r>
+    </w:p>
+    <w:p>
+      <w:pPr/>
+      <w:r>
+        <w:t>29.1 实时 trace 文件</w:t>
+      </w:r>
+    </w:p>
+    <w:p>
+      <w:pPr/>
+      <w:r>
+        <w:t>Stage 2 应支持 STAGE2_TRACE_FILE 和 build option -out_trace_file。未显式设置时，默认文件为输出目录下的 stage2_live.log。文件必须在读取 harden list 和解析 SDC 前创建，采用 line buffering，并在每条记录后 flush，使外部 terminal 可以使用 tail -f 实时查看。</w:t>
+      </w:r>
+    </w:p>
+    <w:p>
+      <w:pPr/>
+      <w:r>
+        <w:t>29.2 运行阶段与 PT query</w:t>
+      </w:r>
+    </w:p>
+    <w:p>
+      <w:pPr/>
+      <w:r>
+        <w:t>实时文件至少记录 BUILD_START、read_harden_list、extract_top_sdc、extract_harden_sdc、map、classify/index、match、write_outputs 和 BUILD_COMPLETE。所有 pt_trace 查询也应同步写入实时文件；STAGE2_VERBOSE_PT_QUERY 只控制 terminal 的 PT_QUERY 打印，不应关闭 trace 文件记录。</w:t>
+      </w:r>
+    </w:p>
+    <w:p>
+      <w:pPr/>
+      <w:r>
+        <w:t>29.3 INVALID_STARTPOINT 诊断</w:t>
+      </w:r>
+    </w:p>
+    <w:p>
+      <w:pPr/>
+      <w:r>
+        <w:t>每次 INVALID_STARTPOINT 必须在进入最终 review 前立即记录脚本实际使用的 from_rec 和 to_rec，包括 object class、full name、direction 和 owner_harden_inst；递归场景还必须记录 path ID、top command ID 和包含当前末端 segment 的 harden command ID。诊断对象必须来自实际 emit 分支，不能用事后对 endpoint 重新执行 all_fanin 得到的对象替代。</w:t>
+      </w:r>
+    </w:p>
+    <w:p>
+      <w:pPr/>
+      <w:r>
+        <w:t>29.4 语义边界与验证</w:t>
+      </w:r>
+    </w:p>
+    <w:p>
+      <w:pPr/>
+      <w:r>
+        <w:t>实时诊断不得自动把 direction=in 的普通 pin 放宽为 startpoint。只有 PT all_fanin -startpoints_only 返回并被标记为 pt_startpoint 的对象，或既有合法 pin/port 规则认可的对象，才能通过验证。回归至少覆盖实时文件创建、阶段记录、from/to/path/command ID 字段以及 BUILD_COMPLETE 计数。</w:t>
       </w:r>
     </w:p>
     <w:sectPr>

</xml_diff>

<commit_message>
Fix PT-proven input startpoints in Stage2 v0.9.5
</commit_message>
<xml_diff>
--- a/soc_sdc_work/Flatten SDC脚本/STA Flatten 2 Set Delay Merge PrimeTime脚本/Stage 2 Integration E2E Delay Merge Proc 规则.docx
+++ b/soc_sdc_work/Flatten SDC脚本/STA Flatten 2 Set Delay Merge PrimeTime脚本/Stage 2 Integration E2E Delay Merge Proc 规则.docx
@@ -8,7 +8,35 @@
         <w:pStyle w:val="Heading1"/>
       </w:pPr>
       <w:r>
-        <w:t>Stage 2：Integration E2E Delay Merge Proc 规则 v0.9.4</w:t>
+        <w:t>Stage 2：Integration E2E Delay Merge Proc 规则 v0.9.5</w:t>
+      </w:r>
+    </w:p>
+    <w:p>
+      <w:pPr>
+        <w:pStyle w:val="Heading2"/>
+      </w:pPr>
+      <w:r>
+        <w:t>修订记录（v0.9.4 -&gt; v0.9.5）</w:t>
+      </w:r>
+    </w:p>
+    <w:p>
+      <w:pPr>
+        <w:pStyle w:val="FirstParagraph"/>
+      </w:pPr>
+      <w:r>
+        <w:t>v0.9.5 修复 PT 已证明合法的 direction=in startpoint 被误报 INVALID_STARTPOINT：</w:t>
+        <w:br/>
+        <w:t>1. 最终 -from 仍优先使用既有静态 direction 合法性规则。</w:t>
+        <w:br/>
+        <w:t>2. 若候选 pin/port/cell 未通过静态规则，使用最终 endpoint 执行 all_fanin -flat -startpoints_only。</w:t>
+        <w:br/>
+        <w:t>3. 只有候选 object class 和 full_name 与 PT 返回的 startpoint 精确一致时，才标记 pt_startpoint=true 并允许生成。</w:t>
+        <w:br/>
+        <w:t>4. 不根据 direction=in 或 is_clock_pin 单独放宽；普通组合逻辑 input pin 仍进入 INVALID_STARTPOINT review。</w:t>
+        <w:br/>
+        <w:t>5. PT 确认结果复用 endpoint startpoint cache，并在 stage2_live.log 记录 STARTPOINT_PT_CONFIRMED。</w:t>
+        <w:br/>
+        <w:t>6. 新增 direct、recursive 和普通 input pin 拒绝回归，mock-Tcl 回归总数增加到 36。</w:t>
       </w:r>
     </w:p>
     <w:p>
@@ -13305,6 +13333,44 @@
       <w:pPr/>
       <w:r>
         <w:t>实时诊断不得自动把 direction=in 的普通 pin 放宽为 startpoint。只有 PT all_fanin -startpoints_only 返回并被标记为 pt_startpoint 的对象，或既有合法 pin/port 规则认可的对象，才能通过验证。回归至少覆盖实时文件创建、阶段记录、from/to/path/command ID 字段以及 BUILD_COMPLETE 计数。</w:t>
+      </w:r>
+    </w:p>
+    <w:p>
+      <w:pPr>
+        <w:pStyle w:val="Heading2"/>
+      </w:pPr>
+      <w:r>
+        <w:t>30. v0.9.5 PT 证明型 startpoint 规则</w:t>
+      </w:r>
+    </w:p>
+    <w:p>
+      <w:r>
+        <w:t>30.1 适用范围</w:t>
+      </w:r>
+    </w:p>
+    <w:p>
+      <w:r>
+        <w:t>当最终 E2E delay 的候选 -from 是 direction=in 的 pin，且既有静态规则不能确认其为合法 startpoint 时，不得立即放宽，也不得立即判定 INVALID_STARTPOINT。脚本必须结合最终 -to endpoint 使用 PT startpoint 集合进行确认。该规则同时适用于 direct、recursive、terminal 和 residual 发射入口。</w:t>
+      </w:r>
+    </w:p>
+    <w:p>
+      <w:r>
+        <w:t>30.2 PT 确认条件</w:t>
+      </w:r>
+    </w:p>
+    <w:p>
+      <w:r>
+        <w:t>对最终 endpoint 执行 all_fanin -flat -startpoints_only。只有候选对象的 object class 与 full_name 均在 PT 返回集合中精确匹配时，才允许把该 record 标记为 pt_startpoint=true。is_clock_pin=true、direction=in 或 report_timing 可报告路径可以作为 debug 证据，但不能单独替代脚本中的集合精确匹配。普通组合逻辑 input pin、hierarchical boundary input pin或未被该 endpoint startpoint 集合返回的对象必须继续进入 INVALID_STARTPOINT review。</w:t>
+      </w:r>
+    </w:p>
+    <w:p>
+      <w:r>
+        <w:t>30.3 性能与输出</w:t>
+      </w:r>
+    </w:p>
+    <w:p>
+      <w:r>
+        <w:t>该复核只在候选 -from 未通过原静态规则时触发，并复用以 endpoint class/full_name 为 key 的 startpoint cache；同一 endpoint 的多 object 展开路径不得重复扫描 PT database。确认成功必须实时记录 STARTPOINT_PT_CONFIRMED，包含实际 from/to object metadata。最终 SDC 仍只写静态 get_pins/get_ports/get_cells 表达式，不得写入 all_fanin 或运行时 collection。</w:t>
       </w:r>
     </w:p>
     <w:sectPr>

</xml_diff>

<commit_message>
Skip disconnected matrix pairs in Stage2 v0.9.6
</commit_message>
<xml_diff>
--- a/soc_sdc_work/Flatten SDC脚本/STA Flatten 2 Set Delay Merge PrimeTime脚本/Stage 2 Integration E2E Delay Merge Proc 规则.docx
+++ b/soc_sdc_work/Flatten SDC脚本/STA Flatten 2 Set Delay Merge PrimeTime脚本/Stage 2 Integration E2E Delay Merge Proc 规则.docx
@@ -8,7 +8,39 @@
         <w:pStyle w:val="Heading1"/>
       </w:pPr>
       <w:r>
-        <w:t>Stage 2：Integration E2E Delay Merge Proc 规则 v0.9.5</w:t>
+        <w:t>Stage 2：Integration E2E Delay Merge Proc 规则 v0.9.6</w:t>
+      </w:r>
+    </w:p>
+    <w:p>
+      <w:pPr>
+        <w:pStyle w:val="Heading2"/>
+      </w:pPr>
+      <w:r>
+        <w:t>修订记录（v0.9.5 -&gt; v0.9.6）</w:t>
+      </w:r>
+    </w:p>
+    <w:p>
+      <w:pPr>
+        <w:pStyle w:val="FirstParagraph"/>
+      </w:pPr>
+      <w:r>
+        <w:t>v0.9.6 增加多 object top delay 矩阵 pair 的 PT 连通性剪枝：</w:t>
+        <w:br/>
+        <w:t>1. 仅作用于 split_total &gt; 1 的 top complete segment。</w:t>
+        <w:br/>
+        <w:t>2. 仅对 direction=in 且 PT is_clock_pin=true 的候选 -from 启用该规则。</w:t>
+        <w:br/>
+        <w:t>3. 使用 pair 自己的原生 top -to boundary 执行 all_fanin -flat -startpoints_only。</w:t>
+        <w:br/>
+        <w:t>4. 候选 clock pin 不在 boundary startpoint 集合中时，标记 NO_PT_CONNECTIVITY_PAIR 并跳过该交叉 pair。</w:t>
+        <w:br/>
+        <w:t>5. 被跳过的 pair 只消费对应展开 top segment，不得消费 harden segment，也不进入 INVALID_STARTPOINT review。</w:t>
+        <w:br/>
+        <w:t>6. 新增 2x2 矩阵回归，确认只生成两条 PT 连通 E2E、跳过两条交叉 pair，并完整消费原始 list 命令；回归总数增加到 38。</w:t>
+      </w:r>
+      <w:r>
+        <w:br/>
+        <w:t>7. 新增查询失败安全回归：PT 查询不可用、对象不存在或命令报错时，不得把空集合当成不连通证明。</w:t>
       </w:r>
     </w:p>
     <w:p>
@@ -13371,6 +13403,57 @@
     <w:p>
       <w:r>
         <w:t>该复核只在候选 -from 未通过原静态规则时触发，并复用以 endpoint class/full_name 为 key 的 startpoint cache；同一 endpoint 的多 object 展开路径不得重复扫描 PT database。确认成功必须实时记录 STARTPOINT_PT_CONFIRMED，包含实际 from/to object metadata。最终 SDC 仍只写静态 get_pins/get_ports/get_cells 表达式，不得写入 all_fanin 或运行时 collection。</w:t>
+      </w:r>
+    </w:p>
+    <w:p>
+      <w:pPr>
+        <w:pStyle w:val="Heading2"/>
+      </w:pPr>
+      <w:r>
+        <w:t>31. v0.9.6 多 object 矩阵连通性规则</w:t>
+      </w:r>
+    </w:p>
+    <w:p>
+      <w:r>
+        <w:t>31.1 SDC 矩阵与实际 timing path</w:t>
+      </w:r>
+    </w:p>
+    <w:p>
+      <w:r>
+        <w:t>多 object -from 与 -to 按 SDC 语义形成笛卡尔积，但矩阵中的每个 object pair 不一定在 linked netlist 中存在 timing path。Stage 2 不得仅因 pair 来自合法 SDC list 就生成跨层 E2E；必须保留 SDC 矩阵语义与 PT 实际连通性的区别。</w:t>
+      </w:r>
+    </w:p>
+    <w:p>
+      <w:r>
+        <w:t>31.2 剪枝适用条件</w:t>
+      </w:r>
+    </w:p>
+    <w:p>
+      <w:r>
+        <w:t>剪枝仅适用于 top complete segment、split_total &gt; 1、单一展开 from/to，并且 from 是 direction=in 且 PT is_clock_pin=true 的 pin。单对象约束、普通组合逻辑 input pin、is_clock_pin 属性不可用或返回 false 的对象继续执行既有 startpoint 验证，不得静默跳过。</w:t>
+      </w:r>
+    </w:p>
+    <w:p>
+      <w:r>
+        <w:t>31.3 PT 证明与处理动作</w:t>
+      </w:r>
+    </w:p>
+    <w:p>
+      <w:r>
+        <w:t>以该展开 pair 的原生 top -to boundary 为 endpoint，查询 all_fanin -flat -startpoints_only。若候选 from 的 object class 与 full_name 不在返回集合中，则该 pair 标记为 NO_PT_CONNECTIVITY_PAIR。实时 trace 和 integration report 必须记录 original ID、split index/total、from、to 和 skip action。该状态不是 review，不得生成 E2E，不得消费 harden delay segment；只消费无实际 timing path 的展开 top pair。若同一原始 list 的其他 pair 已生成或同样被 PT 证明不连通，final rewrite 应按 expanded-pair 计数完整消费原始命令。</w:t>
+      </w:r>
+    </w:p>
+    <w:p>
+      <w:r>
+        <w:t>31.4 缓存和安全边界</w:t>
+      </w:r>
+    </w:p>
+    <w:p>
+      <w:r>
+        <w:t>is_clock_pin 属性查询复用 object attribute cache，boundary startpoint 查询复用 startpoint cache。空集合也必须缓存。不得依据 CP 命名、instance 编号或 list 位置推断配对关系；无法由 PT 证明时保留原 INVALID_STARTPOINT/review 行为。</w:t>
+      </w:r>
+      <w:r>
+        <w:t xml:space="preserve"> 只有 startpoints_only 或既有 full-fanin fallback 查询实际成功时，空集合才可作为不连通证明；boundary 对象不存在、命令不可用或查询失败时必须保留既有 INVALID_STARTPOINT/review 路径，不得消费 pair。</w:t>
       </w:r>
     </w:p>
     <w:sectPr>

</xml_diff>

<commit_message>
Summarize unmerged review severity in Stage2 v0.9.7
</commit_message>
<xml_diff>
--- a/soc_sdc_work/Flatten SDC脚本/STA Flatten 2 Set Delay Merge PrimeTime脚本/Stage 2 Integration E2E Delay Merge Proc 规则.docx
+++ b/soc_sdc_work/Flatten SDC脚本/STA Flatten 2 Set Delay Merge PrimeTime脚本/Stage 2 Integration E2E Delay Merge Proc 规则.docx
@@ -8,7 +8,37 @@
         <w:pStyle w:val="Heading1"/>
       </w:pPr>
       <w:r>
-        <w:t>Stage 2：Integration E2E Delay Merge Proc 规则 v0.9.6</w:t>
+        <w:t>Stage 2：Integration E2E Delay Merge Proc 规则 v0.9.7</w:t>
+      </w:r>
+    </w:p>
+    <w:p>
+      <w:pPr>
+        <w:pStyle w:val="Heading2"/>
+      </w:pPr>
+      <w:r>
+        <w:t>修订记录（v0.9.6 -&gt; v0.9.7）</w:t>
+      </w:r>
+    </w:p>
+    <w:p>
+      <w:pPr>
+        <w:pStyle w:val="FirstParagraph"/>
+      </w:pPr>
+      <w:r>
+        <w:t>v0.9.7 增加 unmerged delay review 的统计和严重度规则：</w:t>
+        <w:br/>
+        <w:t>1. unmerged_delay_review.rpt 开头必须输出 RUN_CONCLUSION、最高严重度和总 review 数。</w:t>
+        <w:br/>
+        <w:t>2. 按 ERROR / WARNING / INFO 统计数量，并输出 severity 定义。</w:t>
+        <w:br/>
+        <w:t>3. REASON_SUMMARY 按严重度和 reason 汇总数量，REASON_ACTION 给出每类建议动作。</w:t>
+        <w:br/>
+        <w:t>4. DETAIL 中每条原始 key/value review 前增加 severity 前缀，原字段保持不变。</w:t>
+        <w:br/>
+        <w:t>5. 存在 ERROR 时结论为 REVIEW_REQUIRED；仅有 WARNING 时为 PASS_WITH_WARNING；无 review 时为 PASS。</w:t>
+        <w:br/>
+        <w:t>6. NO_PT_CONNECTIVITY_PAIR 属于已安全跳过项，不进入 unmerged severity。</w:t>
+        <w:br/>
+        <w:t>7. 回归确认 INVALID_STARTPOINT 被统计为 ERROR，且汇总出现在详情之前；回归总数保持 38。</w:t>
       </w:r>
     </w:p>
     <w:p>
@@ -13454,6 +13484,54 @@
       </w:r>
       <w:r>
         <w:t xml:space="preserve"> 只有 startpoints_only 或既有 full-fanin fallback 查询实际成功时，空集合才可作为不连通证明；boundary 对象不存在、命令不可用或查询失败时必须保留既有 INVALID_STARTPOINT/review 路径，不得消费 pair。</w:t>
+      </w:r>
+    </w:p>
+    <w:p>
+      <w:pPr>
+        <w:pStyle w:val="Heading2"/>
+      </w:pPr>
+      <w:r>
+        <w:t>32. v0.9.7 Unmerged Review 严重度与统计规则</w:t>
+      </w:r>
+    </w:p>
+    <w:p>
+      <w:r>
+        <w:t>32.1 报告顺序</w:t>
+      </w:r>
+    </w:p>
+    <w:p>
+      <w:r>
+        <w:t>unmerged_delay_review.rpt 在 author banner 后必须依次输出 RUN_CONCLUSION、severity summary、severity definition、REASON_SUMMARY、REASON_ACTION 和 DETAIL。统计必须在逐条详情之前，使使用者无需扫描完整文件即可判断本次 run 是否需要阻断签核。</w:t>
+      </w:r>
+    </w:p>
+    <w:p>
+      <w:r>
+        <w:t>32.2 严重度定义</w:t>
+      </w:r>
+    </w:p>
+    <w:p>
+      <w:r>
+        <w:t>ERROR 表示 E2E 无法可靠生成或对象、数值、option、owner 语义不可靠，必须人工确认。WARNING 表示链条未匹配、部分匹配或暂不支持的路径形态，原约束不得静默丢失。INFO 表示预期行为或已安全处理；当前安全跳过项 NO_PT_CONNECTIVITY_PAIR 只进入 integration report，不进入 unmerged review。未知的新 reason 默认按 WARNING 展示，防止新增 reason 导致报告生成失败。</w:t>
+      </w:r>
+    </w:p>
+    <w:p>
+      <w:r>
+        <w:t>32.3 整体结论</w:t>
+      </w:r>
+    </w:p>
+    <w:p>
+      <w:r>
+        <w:t>存在任意 ERROR 时 Overall result=REVIEW_REQUIRED、Highest severity=ERROR；没有 ERROR 但存在 WARNING 时为 PASS_WITH_WARNING；只有 INFO 时为 PASS_WITH_INFO；review_items 为空时为 PASS、Highest severity=NONE。</w:t>
+      </w:r>
+    </w:p>
+    <w:p>
+      <w:r>
+        <w:t>32.4 Reason 统计与详情兼容性</w:t>
+      </w:r>
+    </w:p>
+    <w:p>
+      <w:r>
+        <w:t>REASON_SUMMARY 必须按 ERROR、WARNING、INFO 顺序输出，每个 severity 内按 reason 名称排序，并列出 count 和建议动作。DETAIL 行必须写成 [SEVERITY] reason=... required_action=...，并继续保留 top_id/top_file/top_line/harden_id/harden_file/harden_line 等既有 key/value 字段，避免破坏现有人工检索和后处理。</w:t>
       </w:r>
     </w:p>
     <w:sectPr>

</xml_diff>

<commit_message>
Add Stage2 clock group review outputs
</commit_message>
<xml_diff>
--- a/soc_sdc_work/Flatten SDC脚本/STA Flatten 2 Set Delay Merge PrimeTime脚本/Stage 2 Integration E2E Delay Merge Proc 规则.docx
+++ b/soc_sdc_work/Flatten SDC脚本/STA Flatten 2 Set Delay Merge PrimeTime脚本/Stage 2 Integration E2E Delay Merge Proc 规则.docx
@@ -8,7 +8,37 @@
         <w:pStyle w:val="Heading1"/>
       </w:pPr>
       <w:r>
-        <w:t>Stage 2：Integration E2E Delay Merge Proc 规则 v0.9.7</w:t>
+        <w:t>Stage 2：Integration E2E Delay Merge Proc 规则 v0.9.8</w:t>
+      </w:r>
+    </w:p>
+    <w:p>
+      <w:pPr>
+        <w:pStyle w:val="Heading2"/>
+      </w:pPr>
+      <w:r>
+        <w:t>修订记录（v0.9.7 -&gt; v0.9.8）</w:t>
+      </w:r>
+    </w:p>
+    <w:p>
+      <w:pPr>
+        <w:pStyle w:val="FirstParagraph"/>
+      </w:pPr>
+      <w:r>
+        <w:t>v0.9.8 增加 clock inventory 与 clock group 人工 review 输出，不改变 delay merge 和最终 flatten SDC 的 active timing exception：</w:t>
+        <w:br/>
+        <w:t>1. 在 linked PT design 中使用 get_clocks -quiet * 收集全部 clock。</w:t>
+        <w:br/>
+        <w:t>2. 使用 report_clock 保存 clock 原始报告，使用 report_clock -groups 保存当前已经加载的 group。</w:t>
+        <w:br/>
+        <w:t>3. 输出 &lt;top&gt;_clock_inventory.rpt、&lt;top&gt;_clock_groups_existing.rpt 和 &lt;top&gt;_clock_groups_review.sdc。</w:t>
+        <w:br/>
+        <w:t>4. review SDC 按每个 clock 一个 group 生成，但所有 set_clock_groups 行必须保持注释。</w:t>
+        <w:br/>
+        <w:t>5. Stage 2 不 source review SDC，不自动追加到 &lt;top&gt;_flatten.sdc，不新增 active clock group。</w:t>
+        <w:br/>
+        <w:t>6. report_clock -groups 仅作为已有 SDC 声明的证据，不得视为 PT 自动推断全部同步、异步或互斥关系。</w:t>
+        <w:br/>
+        <w:t>7. 新增 clock 输出和关闭开关回归，mock-Tcl 回归总数增加到 40。</w:t>
       </w:r>
     </w:p>
     <w:p>
@@ -687,91 +717,31 @@
         <w:pStyle w:val="SourceCode"/>
       </w:pPr>
       <w:r>
-        <w:rPr>
-          <w:rStyle w:val="VerbatimChar"/>
-        </w:rPr>
-        <w:t xml:space="preserve">get_pins</w:t>
-      </w:r>
-      <w:r>
-        <w:br/>
-      </w:r>
-      <w:r>
-        <w:rPr>
-          <w:rStyle w:val="VerbatimChar"/>
-        </w:rPr>
-        <w:t xml:space="preserve">get_ports</w:t>
-      </w:r>
-      <w:r>
-        <w:br/>
-      </w:r>
-      <w:r>
-        <w:rPr>
-          <w:rStyle w:val="VerbatimChar"/>
-        </w:rPr>
-        <w:t xml:space="preserve">get_cells</w:t>
-      </w:r>
-      <w:r>
-        <w:br/>
-      </w:r>
-      <w:r>
-        <w:rPr>
-          <w:rStyle w:val="VerbatimChar"/>
-        </w:rPr>
-        <w:t xml:space="preserve">get_nets</w:t>
-      </w:r>
-      <w:r>
-        <w:br/>
-      </w:r>
-      <w:r>
-        <w:rPr>
-          <w:rStyle w:val="VerbatimChar"/>
-        </w:rPr>
-        <w:t xml:space="preserve">get_attribute</w:t>
-      </w:r>
-      <w:r>
-        <w:br/>
-      </w:r>
-      <w:r>
-        <w:rPr>
-          <w:rStyle w:val="VerbatimChar"/>
-        </w:rPr>
-        <w:t xml:space="preserve">sizeof_collection</w:t>
-      </w:r>
-      <w:r>
-        <w:br/>
-      </w:r>
-      <w:r>
-        <w:rPr>
-          <w:rStyle w:val="VerbatimChar"/>
-        </w:rPr>
-        <w:t xml:space="preserve">foreach_in_collection</w:t>
-      </w:r>
-      <w:r>
-        <w:br/>
-      </w:r>
-      <w:r>
-        <w:rPr>
-          <w:rStyle w:val="VerbatimChar"/>
-        </w:rPr>
-        <w:t xml:space="preserve">filter_collection</w:t>
-      </w:r>
-      <w:r>
-        <w:br/>
-      </w:r>
-      <w:r>
-        <w:rPr>
-          <w:rStyle w:val="VerbatimChar"/>
-        </w:rPr>
-        <w:t xml:space="preserve">all_fanin</w:t>
-      </w:r>
-      <w:r>
-        <w:br/>
-      </w:r>
-      <w:r>
-        <w:rPr>
-          <w:rStyle w:val="VerbatimChar"/>
-        </w:rPr>
-        <w:t xml:space="preserve">all_fanout</w:t>
+        <w:t>get_pins</w:t>
+        <w:br/>
+        <w:t>get_ports</w:t>
+        <w:br/>
+        <w:t>get_cells</w:t>
+        <w:br/>
+        <w:t>get_nets</w:t>
+        <w:br/>
+        <w:t>get_attribute</w:t>
+        <w:br/>
+        <w:t>sizeof_collection</w:t>
+        <w:br/>
+        <w:t>foreach_in_collection</w:t>
+        <w:br/>
+        <w:t>filter_collection</w:t>
+        <w:br/>
+        <w:t>all_fanin</w:t>
+        <w:br/>
+        <w:t>all_fanout</w:t>
+        <w:br/>
+        <w:t>get_clocks</w:t>
+        <w:br/>
+        <w:t>report_clock</w:t>
+        <w:br/>
+        <w:t>redirect</w:t>
       </w:r>
     </w:p>
     <w:p>
@@ -13532,6 +13502,124 @@
     <w:p>
       <w:r>
         <w:t>REASON_SUMMARY 必须按 ERROR、WARNING、INFO 顺序输出，每个 severity 内按 reason 名称排序，并列出 count 和建议动作。DETAIL 行必须写成 [SEVERITY] reason=... required_action=...，并继续保留 top_id/top_file/top_line/harden_id/harden_file/harden_line 等既有 key/value 字段，避免破坏现有人工检索和后处理。</w:t>
+      </w:r>
+    </w:p>
+    <w:p>
+      <w:pPr>
+        <w:pStyle w:val="Heading2"/>
+      </w:pPr>
+      <w:r>
+        <w:t>33. v0.9.8 Clock inventory 与 clock group review 规则</w:t>
+      </w:r>
+    </w:p>
+    <w:p>
+      <w:pPr/>
+      <w:r>
+        <w:t>本功能只生成 PT 证据和人工 review 材料，不改变 delay path 的匹配、数值累加、consume、residual、review 或最终 SDC 内容。</w:t>
+      </w:r>
+    </w:p>
+    <w:p>
+      <w:pPr>
+        <w:pStyle w:val="Heading3"/>
+      </w:pPr>
+      <w:r>
+        <w:t>33.1 PT 数据来源</w:t>
+      </w:r>
+    </w:p>
+    <w:p>
+      <w:pPr/>
+      <w:r>
+        <w:t>1. 运行前仍必须完成 current integration top 的 read/link/current_design，并已经 source top 与 harden SDC。</w:t>
+        <w:br/>
+        <w:t>2. 使用 get_clocks -quiet * 收集当前 PT database 中全部 clock；禁止根据 clock 名称猜测同步关系。</w:t>
+        <w:br/>
+        <w:t>3. 使用 report_clock 保存 clock、period、waveform、generated 属性和 source 的 PT 原始报告。</w:t>
+        <w:br/>
+        <w:t>4. 使用 report_clock -groups 保存当前已声明的 asynchronous、logically exclusive 和 physically exclusive group。</w:t>
+        <w:br/>
+        <w:t>5. get_attribute 的 period、is_generated、master_clock、sources 属于兼容性增强信息，必须使用 catch；属性不支持时输出 -，不得中止 Stage 2。</w:t>
+      </w:r>
+    </w:p>
+    <w:p>
+      <w:pPr>
+        <w:pStyle w:val="Heading3"/>
+      </w:pPr>
+      <w:r>
+        <w:t>33.2 输出文件</w:t>
+      </w:r>
+    </w:p>
+    <w:p>
+      <w:pPr>
+        <w:pStyle w:val="SourceCode"/>
+      </w:pPr>
+      <w:r>
+        <w:t>&lt;top&gt;_clock_inventory.rpt</w:t>
+        <w:br/>
+        <w:t>&lt;top&gt;_clock_groups_existing.rpt</w:t>
+        <w:br/>
+        <w:t>&lt;top&gt;_clock_groups_review.sdc</w:t>
+      </w:r>
+    </w:p>
+    <w:p>
+      <w:pPr/>
+      <w:r>
+        <w:t>clock inventory 必须包含作者、版本、current design、clock count，以及每个 clock 的 clock_name、period、is_generated、master_clock 和 sources。existing groups report 必须保留 report_clock -groups 的原始文本。</w:t>
+      </w:r>
+    </w:p>
+    <w:p>
+      <w:pPr>
+        <w:pStyle w:val="Heading3"/>
+      </w:pPr>
+      <w:r>
+        <w:t>33.3 Review SDC 安全边界</w:t>
+      </w:r>
+    </w:p>
+    <w:p>
+      <w:pPr/>
+      <w:r>
+        <w:t>1. review SDC 可以按每个 clock 一个 -group 输出 set_clock_groups -asynchronous 模板。</w:t>
+        <w:br/>
+        <w:t>2. 模板中每一行必须带 # 注释，不得包含 active set_clock_groups。</w:t>
+        <w:br/>
+        <w:t>3. Stage 2 不得 source 该文件，不得把它 include/source/复制到 &lt;top&gt;_flatten.sdc。</w:t>
+        <w:br/>
+        <w:t>4. 一 clock 一 group 会把所有 group 互相视为异步，因此只能作为人工整理起点。</w:t>
+        <w:br/>
+        <w:t>5. generated clock、master clock、同步派生 clock 和具有明确 timing 关系的 clock 应由人工合并到同一 group。</w:t>
+        <w:br/>
+        <w:t>6. logically exclusive、physically exclusive 和 asynchronous 属性必须依据设计意图确认，不能仅由无共同 master 或命名差异推断。</w:t>
+        <w:br/>
+        <w:t>7. 已有 clock group 只报告、不修改；integration_delay_merge.rpt 必须记录 Active clock groups added = 0。</w:t>
+        <w:br/>
+        <w:t>8. 少于两个 clock 时只生成说明，不生成 set_clock_groups 模板。</w:t>
+      </w:r>
+    </w:p>
+    <w:p>
+      <w:pPr>
+        <w:pStyle w:val="Heading3"/>
+      </w:pPr>
+      <w:r>
+        <w:t>33.4 配置与回归</w:t>
+      </w:r>
+    </w:p>
+    <w:p>
+      <w:pPr>
+        <w:pStyle w:val="SourceCode"/>
+      </w:pPr>
+      <w:r>
+        <w:t>GENERATE_CLOCK_GROUP_REVIEW=true</w:t>
+        <w:br/>
+        <w:t>OUT_CLOCK_INVENTORY=&lt;top&gt;_clock_inventory.rpt</w:t>
+        <w:br/>
+        <w:t>OUT_CLOCK_GROUPS_REPORT=&lt;top&gt;_clock_groups_existing.rpt</w:t>
+        <w:br/>
+        <w:t>OUT_CLOCK_GROUP_REVIEW_SDC=&lt;top&gt;_clock_groups_review.sdc</w:t>
+      </w:r>
+    </w:p>
+    <w:p>
+      <w:pPr/>
+      <w:r>
+        <w:t>回归至少覆盖普通 clock、generated/master metadata、可选 attribute 不支持、稳定 clock 排序、模板全注释、最终 flatten SDC 不含新增 clock group，以及 GENERATE_CLOCK_GROUP_REVIEW=false 时不生成三个输出文件。</w:t>
       </w:r>
     </w:p>
     <w:sectPr>

</xml_diff>

<commit_message>
Expand Stage2 clock review regression matrix
</commit_message>
<xml_diff>
--- a/soc_sdc_work/Flatten SDC脚本/STA Flatten 2 Set Delay Merge PrimeTime脚本/Stage 2 Integration E2E Delay Merge Proc 规则.docx
+++ b/soc_sdc_work/Flatten SDC脚本/STA Flatten 2 Set Delay Merge PrimeTime脚本/Stage 2 Integration E2E Delay Merge Proc 规则.docx
@@ -38,7 +38,7 @@
         <w:br/>
         <w:t>6. report_clock -groups 仅作为已有 SDC 声明的证据，不得视为 PT 自动推断全部同步、异步或互斥关系。</w:t>
         <w:br/>
-        <w:t>7. 新增 clock 输出和关闭开关回归，mock-Tcl 回归总数增加到 40。</w:t>
+        <w:t>7. 新增基础 clock 输出和关闭开关回归，并进一步覆盖 128-clock 大集合、generated/master 链、特殊名称、三类 existing group、PT redirect、attribute 不支持、0/1 clock 和关闭后的零 PT 查询；mock-Tcl 回归总数增加到 45。</w:t>
       </w:r>
     </w:p>
     <w:p>
@@ -13619,7 +13619,7 @@
     <w:p>
       <w:pPr/>
       <w:r>
-        <w:t>回归至少覆盖普通 clock、generated/master metadata、可选 attribute 不支持、稳定 clock 排序、模板全注释、最终 flatten SDC 不含新增 clock group，以及 GENERATE_CLOCK_GROUP_REVIEW=false 时不生成三个输出文件。</w:t>
+        <w:t>回归至少覆盖普通 clock、generated/master metadata、可选 attribute 不支持、稳定 clock 排序、模板全注释、最终 flatten SDC 不含新增 clock group，以及 GENERATE_CLOCK_GROUP_REVIEW=false 时不生成三个输出文件。复杂验证还必须覆盖 128-clock 大集合、clock 名含层级或 bus 下标、asynchronous/logically exclusive/physically exclusive 原始报告、PT redirect 捕获、0/1 clock 边界和关闭功能后的零 get_clocks/report_clock 查询。当前 mock-Tcl 回归总数为 45。</w:t>
       </w:r>
     </w:p>
     <w:sectPr>

</xml_diff>

<commit_message>
Chunk Stage2 metadata queries in v0.9.9
</commit_message>
<xml_diff>
--- a/soc_sdc_work/Flatten SDC脚本/STA Flatten 2 Set Delay Merge PrimeTime脚本/Stage 2 Integration E2E Delay Merge Proc 规则.docx
+++ b/soc_sdc_work/Flatten SDC脚本/STA Flatten 2 Set Delay Merge PrimeTime脚本/Stage 2 Integration E2E Delay Merge Proc 规则.docx
@@ -8,7 +8,37 @@
         <w:pStyle w:val="Heading1"/>
       </w:pPr>
       <w:r>
-        <w:t>Stage 2：Integration E2E Delay Merge Proc 规则 v0.9.8</w:t>
+        <w:t>Stage 2：Integration E2E Delay Merge Proc 规则 v0.9.9</w:t>
+      </w:r>
+    </w:p>
+    <w:p>
+      <w:pPr>
+        <w:pStyle w:val="Heading2"/>
+      </w:pPr>
+      <w:r>
+        <w:t>修订记录（v0.9.8 -&gt; v0.9.9）</w:t>
+      </w:r>
+    </w:p>
+    <w:p>
+      <w:pPr>
+        <w:pStyle w:val="FirstParagraph"/>
+      </w:pPr>
+      <w:r>
+        <w:t>v0.9.9 对 direction metadata multi-pattern getter 增加有界分块，不改变对象集合、direction 判定或最终约束语义：</w:t>
+        <w:br/>
+        <w:t>1. 新增 STAGE2_METADATA_BATCH_ENABLED / -metadata_batch_enabled，默认 true。关闭后仍逐对象执行 getter 和 get_attribute direction，不得跳过 metadata hydration。</w:t>
+        <w:br/>
+        <w:t>2. 新增 STAGE2_METADATA_BATCH_SIZE / -metadata_batch_size，默认 128，必须是大于等于 1 的整数。</w:t>
+        <w:br/>
+        <w:t>3. 同一 object class 的已去重 full-name 列表按 batch size 分块，每块独立执行 get_pins/get_ports/get_cells/get_nets。</w:t>
+        <w:br/>
+        <w:t>4. 每块必须比较 expected 与 actual full_name 排序去重集合。完全相等时立即写 cache；命令报错、少返回或多返回时只对失败块逐对象回退，前后成功块不得重复查询。</w:t>
+        <w:br/>
+        <w:t>5. stage2_live.log 对每块输出 METADATA_BATCH_BEGIN 和 METADATA_BATCH_END，包含 class、chunk 序号/总数、pattern 数、返回数、状态和 elapsed_ms；失败块另输出 METADATA_BATCH_FALLBACK。</w:t>
+        <w:br/>
+        <w:t>6. integration_delay_merge.rpt 增加 enabled/size 配置，并扩展 performance statistics，记录成功块、fallback、返回对象数、累计耗时和关闭 batching 的分组数。</w:t>
+        <w:br/>
+        <w:t>7. 新增不同 chunk size 输出等价、返回顺序变化、中间块报错、中间块集合不完整、关闭 batching 和非法 size 回归；mock-Tcl 回归总数增加到 50。</w:t>
       </w:r>
     </w:p>
     <w:p>
@@ -13619,7 +13649,121 @@
     <w:p>
       <w:pPr/>
       <w:r>
-        <w:t>回归至少覆盖普通 clock、generated/master metadata、可选 attribute 不支持、稳定 clock 排序、模板全注释、最终 flatten SDC 不含新增 clock group，以及 GENERATE_CLOCK_GROUP_REVIEW=false 时不生成三个输出文件。复杂验证还必须覆盖 128-clock 大集合、clock 名含层级或 bus 下标、asynchronous/logically exclusive/physically exclusive 原始报告、PT redirect 捕获、0/1 clock 边界和关闭功能后的零 get_clocks/report_clock 查询。当前 mock-Tcl 回归总数为 45。</w:t>
+        <w:t>回归至少覆盖普通 clock、generated/master metadata、可选 attribute 不支持、稳定 clock 排序、模板全注释、最终 flatten SDC 不含新增 clock group，以及 GENERATE_CLOCK_GROUP_REVIEW=false 时不生成三个输出文件。复杂验证还必须覆盖 128-clock 大集合、clock 名含层级或 bus 下标、asynchronous/logically exclusive/physically exclusive 原始报告、PT redirect 捕获、0/1 clock 边界和关闭功能后的零 get_clocks/report_clock 查询。v0.9.9 扩展后当前 mock-Tcl 回归总数为 50。</w:t>
+      </w:r>
+    </w:p>
+    <w:p>
+      <w:pPr>
+        <w:pStyle w:val="Heading2"/>
+      </w:pPr>
+      <w:r>
+        <w:t>34. v0.9.9 Metadata direction 查询分块规则</w:t>
+      </w:r>
+    </w:p>
+    <w:p>
+      <w:pPr>
+        <w:pStyle w:val="Heading3"/>
+      </w:pPr>
+      <w:r>
+        <w:t>34.1 目标与语义边界</w:t>
+      </w:r>
+    </w:p>
+    <w:p>
+      <w:pPr/>
+      <w:r>
+        <w:t>大型 linked PrimeTime design 中，一次向 get_pins、get_ports、get_cells 或 get_nets 提交数千个 full-name pattern 可能长时间不返回。分块只改变 PT 查询调度，不得改变原始 object record 顺序、pending 去重、cache key、direction 判定、startpoint/endpoint 合法性或最终 SDC 内容。</w:t>
+      </w:r>
+    </w:p>
+    <w:p>
+      <w:pPr>
+        <w:pStyle w:val="Heading3"/>
+      </w:pPr>
+      <w:r>
+        <w:t>34.2 配置</w:t>
+      </w:r>
+    </w:p>
+    <w:p>
+      <w:pPr>
+        <w:pStyle w:val="SourceCode"/>
+      </w:pPr>
+      <w:r>
+        <w:t>STAGE2_METADATA_BATCH_ENABLED=true</w:t>
+        <w:br/>
+        <w:t>STAGE2_METADATA_BATCH_SIZE=128</w:t>
+        <w:br/>
+        <w:t>-metadata_batch_enabled true</w:t>
+        <w:br/>
+        <w:t>-metadata_batch_size 128</w:t>
+      </w:r>
+    </w:p>
+    <w:p>
+      <w:pPr/>
+      <w:r>
+        <w:t>metadata_batch_size 必须是大于等于 1 的整数。默认 128；真实 PT 中若单块仍然耗时过长，可以降为 64 或 32。关闭 metadata_batch_enabled 时必须逐对象执行原有查询路径，不能把关闭性能优化解释为关闭 direction 检查。</w:t>
+      </w:r>
+    </w:p>
+    <w:p>
+      <w:pPr>
+        <w:pStyle w:val="Heading3"/>
+      </w:pPr>
+      <w:r>
+        <w:t>34.3 分块、校验与回退</w:t>
+      </w:r>
+    </w:p>
+    <w:p>
+      <w:pPr/>
+      <w:r>
+        <w:t>1. 解析阶段继续按 pin、port、cell、net 分组，并在分块前按 object class + full_name 去重。</w:t>
+        <w:br/>
+        <w:t>2. 每块最多包含 metadata_batch_size 个 pattern；例如 2156 个 pin 在默认配置下形成 17 个 chunk。</w:t>
+        <w:br/>
+        <w:t>3. 每块读取返回对象的 full_name 和 direction，并对 expected/actual full_name 分别排序去重后做精确集合比较。不得只比较数量。</w:t>
+        <w:br/>
+        <w:t>4. 集合完全相等时，该块所有 direction 写入 object_attribute_cache。返回顺序与请求顺序不同不得影响最终 record 或约束顺序。</w:t>
+        <w:br/>
+        <w:t>5. getter 报错、集合少返回、集合多返回或 collection API 不可用时，该块标记失败，并仅对块内对象调用 pt_get_attr_by_name。已经成功的块不得重复查询。</w:t>
+        <w:br/>
+        <w:t>6. 任一失败块都不得导致对象静默丢失、wildcard 放宽、direction 留空后被误接受，或 from/through/to 集合发生变化。</w:t>
+      </w:r>
+    </w:p>
+    <w:p>
+      <w:pPr>
+        <w:pStyle w:val="Heading3"/>
+      </w:pPr>
+      <w:r>
+        <w:t>34.4 实时诊断与统计</w:t>
+      </w:r>
+    </w:p>
+    <w:p>
+      <w:pPr>
+        <w:pStyle w:val="SourceCode"/>
+      </w:pPr>
+      <w:r>
+        <w:t>METADATA_BATCH_BEGIN class=pin chunk=1/17 getter=get_pins patterns=128</w:t>
+        <w:br/>
+        <w:t>METADATA_BATCH_END class=pin chunk=1/17 status=OK patterns=128 returned=128 unique_returned=128 elapsed_ms=420</w:t>
+        <w:br/>
+        <w:t>METADATA_BATCH_FALLBACK class=pin chunk=6/17 patterns=128 reason={...} mode=individual</w:t>
+      </w:r>
+    </w:p>
+    <w:p>
+      <w:pPr/>
+      <w:r>
+        <w:t>BEGIN 必须在调用 PT getter 前写入并 flush；END 必须在成功、命令异常和集合不匹配路径中写入。elapsed_ms 与统计只用于性能诊断，不得参与功能分支。performance statistics 至少记录 metadata_batch_queries、metadata_batch_records、metadata_batch_successes、metadata_batch_fallbacks、metadata_batch_returned_records、metadata_batch_elapsed_ms、metadata_batch_disabled_groups 和 metadata_individual_queries。</w:t>
+      </w:r>
+    </w:p>
+    <w:p>
+      <w:pPr>
+        <w:pStyle w:val="Heading3"/>
+      </w:pPr>
+      <w:r>
+        <w:t>34.5 回归与真实 PT 验证</w:t>
+      </w:r>
+    </w:p>
+    <w:p>
+      <w:pPr/>
+      <w:r>
+        <w:t>mock-Tcl 回归必须覆盖 batch size 1、普通分块、size 大于对象总数、返回 collection 顺序变化、中间块 getter 报错、中间块少返回对象、关闭 batching、非法 size，以及各模式最终 generated/final SDC 功能内容等价。正式使用前仍需在真实 linked design 中观察每块 elapsed_ms、CPU/内存和 fallback，并确认生成约束、unmerged review、ignored exception 与未分块版本一致。</w:t>
       </w:r>
     </w:p>
     <w:sectPr>

</xml_diff>

<commit_message>
Avoid Stage2 passthrough matrix expansion
</commit_message>
<xml_diff>
--- a/soc_sdc_work/Flatten SDC脚本/STA Flatten 2 Set Delay Merge PrimeTime脚本/Stage 2 Integration E2E Delay Merge Proc 规则.docx
+++ b/soc_sdc_work/Flatten SDC脚本/STA Flatten 2 Set Delay Merge PrimeTime脚本/Stage 2 Integration E2E Delay Merge Proc 规则.docx
@@ -8,7 +8,37 @@
         <w:pStyle w:val="Heading1"/>
       </w:pPr>
       <w:r>
-        <w:t>Stage 2：Integration E2E Delay Merge Proc 规则 v0.9.9</w:t>
+        <w:t>Stage 2：Integration E2E Delay Merge Proc 规则 v0.9.10</w:t>
+      </w:r>
+    </w:p>
+    <w:p>
+      <w:pPr>
+        <w:pStyle w:val="Heading2"/>
+      </w:pPr>
+      <w:r>
+        <w:t>修订记录（v0.9.9 -&gt; v0.9.10）</w:t>
+      </w:r>
+    </w:p>
+    <w:p>
+      <w:pPr>
+        <w:pStyle w:val="FirstParagraph"/>
+      </w:pPr>
+      <w:r>
+        <w:t>v0.9.10 避免在纯内部大矩阵上执行无意义的 metadata hydration 和笛卡尔积展开，同时保留原始 SDC 语义：</w:t>
+        <w:br/>
+        <w:t>1. 对显式 complete delay，先解析 -from、-to 和可选 -through 的静态 object record。仅当所有表达式都是非空、无 wildcard/变量/动态 option 的精确 get_pins/list，且没有对象可能是 immediate harden boundary pin 时，标记 STRUCTURAL_NO_IMMEDIATE_HARDEN_BOUNDARY。</w:t>
+        <w:br/>
+        <w:t>2. structural passthrough 在 direction metadata 查询前完成，不调用 get_pins/get_attribute，不生成 from x to pair。整条原命令作为一个 passthrough 记录，final flatten SDC 逐字保留原文。</w:t>
+        <w:br/>
+        <w:t>3. 任一 immediate boundary、clock、port、cell、net、unknown、wildcard、变量、动态 selector、open_from/open_to 或 edge-specific option 都不得进入快路，必须执行既有 hydration、classification、merge 和 partial rewrite。</w:t>
+        <w:br/>
+        <w:t>4. 新增 STAGE2_MAX_SEGMENT_PAIRS / -max_segment_pairs，默认 100000，必须是大于等于 1 的整数。非结构直通矩阵超过上限时禁止 materialize，原命令完整保留，并且只增加一条 MATRIX_EXPANSION_LIMIT review。</w:t>
+        <w:br/>
+        <w:t>5. 新增 SEGMENT_PLAN、SEGMENT_EXPAND_BEGIN、SEGMENT_EXPAND_PROGRESS 和 SEGMENT_EXPAND_END，记录 source、file、line、from/to 数、product、action 和 elapsed_ms。progress 只对大矩阵有界输出。</w:t>
+        <w:br/>
+        <w:t>6. performance statistics 新增 structural_passthrough_commands、structural_passthrough_objects、matrix_pairs_avoided、matrix_expansion_limited、matrix_pairs_expanded 和 matrix_expand_elapsed_ms。</w:t>
+        <w:br/>
+        <w:t>7. structural aggregate segment 属于不可 consume 的 invariant；若未来代码尝试 consume，必须立即报 internal error，禁止误删整条原约束。</w:t>
       </w:r>
     </w:p>
     <w:p>
@@ -11299,175 +11329,61 @@
         <w:pStyle w:val="SourceCode"/>
       </w:pPr>
       <w:r>
-        <w:rPr>
-          <w:rStyle w:val="VerbatimChar"/>
-        </w:rPr>
-        <w:t xml:space="preserve">-top_sdc &lt;file&gt;</w:t>
-      </w:r>
-      <w:r>
-        <w:br/>
-      </w:r>
-      <w:r>
-        <w:rPr>
-          <w:rStyle w:val="VerbatimChar"/>
-        </w:rPr>
-        <w:t xml:space="preserve">-harden_list &lt;csv&gt;</w:t>
-      </w:r>
-      <w:r>
-        <w:br/>
-      </w:r>
-      <w:r>
-        <w:rPr>
-          <w:rStyle w:val="VerbatimChar"/>
-        </w:rPr>
-        <w:t xml:space="preserve">-out_e2e_sdc &lt;file&gt;</w:t>
-      </w:r>
-      <w:r>
-        <w:br/>
-      </w:r>
-      <w:r>
-        <w:rPr>
-          <w:rStyle w:val="VerbatimChar"/>
-        </w:rPr>
-        <w:t xml:space="preserve">-out_final_sdc &lt;file&gt;</w:t>
-      </w:r>
-      <w:r>
-        <w:br/>
-      </w:r>
-      <w:r>
-        <w:rPr>
-          <w:rStyle w:val="VerbatimChar"/>
-        </w:rPr>
-        <w:t xml:space="preserve">-out_report &lt;file&gt;</w:t>
-      </w:r>
-      <w:r>
-        <w:br/>
-      </w:r>
-      <w:r>
-        <w:br/>
-      </w:r>
-      <w:r>
-        <w:rPr>
-          <w:rStyle w:val="VerbatimChar"/>
-        </w:rPr>
-        <w:t xml:space="preserve">-merge_mode replace | additive</w:t>
-      </w:r>
-      <w:r>
-        <w:br/>
-      </w:r>
-      <w:r>
-        <w:rPr>
-          <w:rStyle w:val="VerbatimChar"/>
-        </w:rPr>
-        <w:t xml:space="preserve">-top_open_from_mode through | enumerate_static_startpoints | collapse_single_boundary</w:t>
-      </w:r>
-      <w:r>
-        <w:br/>
-      </w:r>
-      <w:r>
-        <w:rPr>
-          <w:rStyle w:val="VerbatimChar"/>
-        </w:rPr>
-        <w:t xml:space="preserve">-allow_through true | false</w:t>
-      </w:r>
-      <w:r>
-        <w:br/>
-      </w:r>
-      <w:r>
-        <w:rPr>
-          <w:rStyle w:val="VerbatimChar"/>
-        </w:rPr>
-        <w:t xml:space="preserve">-allow_collapse_single_boundary true | false</w:t>
-      </w:r>
-      <w:r>
-        <w:br/>
-      </w:r>
-      <w:r>
-        <w:rPr>
-          <w:rStyle w:val="VerbatimChar"/>
-        </w:rPr>
-        <w:t xml:space="preserve">-partial_merge_policy residual_through | review</w:t>
-      </w:r>
-      <w:r>
-        <w:br/>
-      </w:r>
-      <w:r>
-        <w:rPr>
-          <w:rStyle w:val="VerbatimChar"/>
-        </w:rPr>
-        <w:t xml:space="preserve">-unmatched_harden_policy review | conservative_through</w:t>
-      </w:r>
-      <w:r>
-        <w:br/>
-      </w:r>
-      <w:r>
-        <w:br/>
-      </w:r>
-      <w:r>
-        <w:rPr>
-          <w:rStyle w:val="VerbatimChar"/>
-        </w:rPr>
-        <w:t xml:space="preserve">-max_endpoints &lt;N&gt;</w:t>
-      </w:r>
-      <w:r>
-        <w:br/>
-      </w:r>
-      <w:r>
-        <w:rPr>
-          <w:rStyle w:val="VerbatimChar"/>
-        </w:rPr>
-        <w:t xml:space="preserve">-max_enum_objects &lt;N&gt;</w:t>
-      </w:r>
-      <w:r>
-        <w:br/>
-      </w:r>
-      <w:r>
-        <w:br/>
-      </w:r>
-      <w:r>
-        <w:rPr>
-          <w:rStyle w:val="VerbatimChar"/>
-        </w:rPr>
-        <w:t xml:space="preserve">-check_units true</w:t>
-      </w:r>
-      <w:r>
-        <w:br/>
-      </w:r>
-      <w:r>
-        <w:rPr>
-          <w:rStyle w:val="VerbatimChar"/>
-        </w:rPr>
-        <w:t xml:space="preserve">-expect_units &lt;spec&gt;</w:t>
-      </w:r>
-      <w:r>
-        <w:br/>
-      </w:r>
-      <w:r>
-        <w:br/>
-      </w:r>
-      <w:r>
-        <w:rPr>
-          <w:rStyle w:val="VerbatimChar"/>
-        </w:rPr>
-        <w:t xml:space="preserve">-strict</w:t>
-      </w:r>
-      <w:r>
-        <w:br/>
-      </w:r>
-      <w:r>
-        <w:rPr>
-          <w:rStyle w:val="VerbatimChar"/>
-        </w:rPr>
-        <w:t xml:space="preserve">-debug</w:t>
-      </w:r>
-      <w:r>
-        <w:br/>
-      </w:r>
-      <w:r>
-        <w:rPr>
-          <w:rStyle w:val="VerbatimChar"/>
-        </w:rPr>
-        <w:t xml:space="preserve">-full_detail</w:t>
+        <w:t>-top_sdc &lt;file&gt;</w:t>
+        <w:br/>
+        <w:t>-harden_list &lt;csv&gt;</w:t>
+        <w:br/>
+        <w:t>-out_e2e_sdc &lt;file&gt;</w:t>
+        <w:br/>
+        <w:t>-out_final_sdc &lt;file&gt;</w:t>
+        <w:br/>
+        <w:t>-out_report &lt;file&gt;</w:t>
+        <w:br/>
+        <w:br/>
+        <w:t>-merge_mode replace | additive</w:t>
+        <w:br/>
+        <w:t>-top_open_from_mode through | enumerate_static_startpoints | collapse_single_boundary</w:t>
+        <w:br/>
+        <w:t>-allow_through true | false</w:t>
+        <w:br/>
+        <w:t>-allow_collapse_single_boundary true | false</w:t>
+        <w:br/>
+        <w:t>-partial_merge_policy residual_through | review</w:t>
+        <w:br/>
+        <w:t>-unmatched_harden_policy review | conservative_through</w:t>
+        <w:br/>
+        <w:br/>
+        <w:t>-max_endpoints &lt;N&gt;</w:t>
+        <w:br/>
+        <w:t>-max_enum_objects &lt;N&gt;</w:t>
+        <w:br/>
+        <w:t>-max_segment_pairs &lt;N&gt;</w:t>
+        <w:br/>
+        <w:t>-max_segment_pairs &lt;N&gt;</w:t>
+        <w:br/>
+        <w:t>-max_segment_pairs &lt;N&gt;</w:t>
+        <w:br/>
+        <w:t>-max_segment_pairs &lt;N&gt;</w:t>
+        <w:br/>
+        <w:t>-max_segment_pairs &lt;N&gt;</w:t>
+        <w:br/>
+        <w:t>-max_segment_pairs &lt;N&gt;</w:t>
+        <w:br/>
+        <w:t>-max_segment_pairs &lt;N&gt;</w:t>
+        <w:br/>
+        <w:t>-max_segment_pairs &lt;N&gt;</w:t>
+        <w:br/>
+        <w:br/>
+        <w:t>-check_units true</w:t>
+        <w:br/>
+        <w:t>-expect_units &lt;spec&gt;</w:t>
+        <w:br/>
+        <w:br/>
+        <w:t>-strict</w:t>
+        <w:br/>
+        <w:t>-debug</w:t>
+        <w:br/>
+        <w:t>-full_detail</w:t>
       </w:r>
     </w:p>
     <w:p>
@@ -11504,6 +11420,22 @@
         <w:t>-max_endpoints 1000</w:t>
         <w:br/>
         <w:t>-max_enum_objects 64</w:t>
+        <w:br/>
+        <w:t>-max_segment_pairs 100000</w:t>
+        <w:br/>
+        <w:t>-max_segment_pairs 100000</w:t>
+        <w:br/>
+        <w:t>-max_segment_pairs 100000</w:t>
+        <w:br/>
+        <w:t>-max_segment_pairs 100000</w:t>
+        <w:br/>
+        <w:t>-max_segment_pairs 100000</w:t>
+        <w:br/>
+        <w:t>-max_segment_pairs 100000</w:t>
+        <w:br/>
+        <w:t>-max_segment_pairs 100000</w:t>
+        <w:br/>
+        <w:t>-max_segment_pairs 100000</w:t>
         <w:br/>
         <w:t>-compact_bus true</w:t>
         <w:br/>
@@ -13649,7 +13581,7 @@
     <w:p>
       <w:pPr/>
       <w:r>
-        <w:t>回归至少覆盖普通 clock、generated/master metadata、可选 attribute 不支持、稳定 clock 排序、模板全注释、最终 flatten SDC 不含新增 clock group，以及 GENERATE_CLOCK_GROUP_REVIEW=false 时不生成三个输出文件。复杂验证还必须覆盖 128-clock 大集合、clock 名含层级或 bus 下标、asynchronous/logically exclusive/physically exclusive 原始报告、PT redirect 捕获、0/1 clock 边界和关闭功能后的零 get_clocks/report_clock 查询。v0.9.9 扩展后当前 mock-Tcl 回归总数为 50。</w:t>
+        <w:t>回归至少覆盖普通 clock、generated/master metadata、可选 attribute 不支持、稳定 clock 排序、模板全注释、最终 flatten SDC 不含新增 clock group，以及 GENERATE_CLOCK_GROUP_REVIEW=false 时不生成三个输出文件。复杂验证还必须覆盖 128-clock 大集合、clock 名含层级或 bus 下标、asynchronous/logically exclusive/physically exclusive 原始报告、PT redirect 捕获、0/1 clock 边界和关闭功能后的零 get_clocks/report_clock 查询。v0.9.10 扩展后当前 mock-Tcl 回归总数为 55。</w:t>
       </w:r>
     </w:p>
     <w:p>
@@ -13764,6 +13696,106 @@
       <w:pPr/>
       <w:r>
         <w:t>mock-Tcl 回归必须覆盖 batch size 1、普通分块、size 大于对象总数、返回 collection 顺序变化、中间块 getter 报错、中间块少返回对象、关闭 batching、非法 size，以及各模式最终 generated/final SDC 功能内容等价。正式使用前仍需在真实 linked design 中观察每块 elapsed_ms、CPU/内存和 fallback，并确认生成约束、unmerged review、ignored exception 与未分块版本一致。</w:t>
+      </w:r>
+    </w:p>
+    <w:p>
+      <w:pPr>
+        <w:pStyle w:val="Heading2"/>
+      </w:pPr>
+      <w:r>
+        <w:t>35. v0.9.10 Structural passthrough 与矩阵展开保护规则</w:t>
+      </w:r>
+    </w:p>
+    <w:p>
+      <w:pPr>
+        <w:pStyle w:val="Heading3"/>
+      </w:pPr>
+      <w:r>
+        <w:t>35.1 目标与适用边界</w:t>
+      </w:r>
+    </w:p>
+    <w:p>
+      <w:pPr/>
+      <w:r>
+        <w:t>DC 产生的 complete delay 可能同时包含数千个 -from 和 -to pin。旧流程会先补齐全部 direction metadata，再 materialize 完整笛卡尔积，最后才发现所有 pair 都是与 Stage 2 harden boundary 无关的 passthrough。v0.9.10 允许在能够由静态层级结构证明整条命令不含 immediate harden boundary 时提前结束。该判断只决定 Stage 2 是否处理，不删除、不改写也不重新生成原始 timing constraint。</w:t>
+      </w:r>
+    </w:p>
+    <w:p>
+      <w:pPr>
+        <w:pStyle w:val="Heading3"/>
+      </w:pPr>
+      <w:r>
+        <w:t>35.2 Structural passthrough 证明条件</w:t>
+      </w:r>
+    </w:p>
+    <w:p>
+      <w:pPr/>
+      <w:r>
+        <w:t>一条命令只有同时满足以下条件才可命中：</w:t>
+        <w:br/>
+        <w:t>1. delay 为数值，显式同时存在 -from 和 -to，且没有 edge-specific option。</w:t>
+        <w:br/>
+        <w:t>2. -from、-to 以及每个 -through 都由 get_pins 或嵌套 list 构成，每个 selector 非空且为精确名称。</w:t>
+        <w:br/>
+        <w:t>3. 名称不含 wildcard、变量或动态 command substitution；object class 必须是 pin。</w:t>
+        <w:br/>
+        <w:t>4. top source 的所有 record 都不是 harden_list 中任一 instance 的 immediate pin。harden source 的所有 record 都不是当前 harden instance 的 immediate pin。</w:t>
+        <w:br/>
+        <w:t>5. 任一条件无法静态证明时必须整体回落既有流程，不允许只快判矩阵的一部分。</w:t>
+      </w:r>
+    </w:p>
+    <w:p>
+      <w:pPr/>
+      <w:r>
+        <w:t>命中后的 command-level segment 必须设置 structural_passthrough=true 和稳定 reason，并记录 from/to/object/pair 数。不得执行 metadata hydration，不得调用 expand_segment 的 pair 循环，不得进入 consume_segment。passthrough report 按一条原始 command 计数并只打印计数，不得把数千个对象名复制进 report。</w:t>
+      </w:r>
+    </w:p>
+    <w:p>
+      <w:pPr>
+        <w:pStyle w:val="Heading3"/>
+      </w:pPr>
+      <w:r>
+        <w:t>35.3 Matrix safety limit</w:t>
+      </w:r>
+    </w:p>
+    <w:p>
+      <w:pPr>
+        <w:pStyle w:val="SourceCode"/>
+      </w:pPr>
+      <w:r>
+        <w:t>STAGE2_MAX_SEGMENT_PAIRS=100000</w:t>
+        <w:br/>
+        <w:t>-max_segment_pairs 100000</w:t>
+      </w:r>
+    </w:p>
+    <w:p>
+      <w:pPr/>
+      <w:r>
+        <w:t>max_segment_pairs 必须是大于等于 1 的整数。结构直通判定优先执行；其余 status=ok 且需要展开的 segment 按 effective_from_count x to_count 计算 product。只有 product &lt;= limit 才可 materialize。product &gt; limit 时设置 MATRIX_EXPANSION_LIMIT，保留原始命令、禁止 partial consume，并生成一条包含 from_count、to_count、pair_count 和 limit 的 review。不得静默截断到 limit，也不得只合并矩阵中的前 N 个 pair。</w:t>
+      </w:r>
+    </w:p>
+    <w:p>
+      <w:pPr>
+        <w:pStyle w:val="Heading3"/>
+      </w:pPr>
+      <w:r>
+        <w:t>35.4 实时诊断与统计</w:t>
+      </w:r>
+    </w:p>
+    <w:p>
+      <w:pPr>
+        <w:pStyle w:val="SourceCode"/>
+      </w:pPr>
+      <w:r>
+        <w:t>SEGMENT_PLAN ... product=10555776 action=STRUCTURAL_PASSTHROUGH</w:t>
+        <w:br/>
+        <w:t>SEGMENT_PLAN ... product=160000 action=MATRIX_EXPANSION_LIMIT limit=100000</w:t>
+        <w:br/>
+        <w:t>SEGMENT_EXPAND_BEGIN ... product=20000</w:t>
+        <w:br/>
+        <w:t>SEGMENT_EXPAND_PROGRESS ... completed=10000 total=20000</w:t>
+        <w:br/>
+        <w:t>SEGMENT_EXPAND_END ... expanded=20000 elapsed_ms=...</w:t>
       </w:r>
     </w:p>
     <w:sectPr>

</xml_diff>

<commit_message>
Guard Stage2 port-mapped matrix expansion
</commit_message>
<xml_diff>
--- a/soc_sdc_work/Flatten SDC脚本/STA Flatten 2 Set Delay Merge PrimeTime脚本/Stage 2 Integration E2E Delay Merge Proc 规则.docx
+++ b/soc_sdc_work/Flatten SDC脚本/STA Flatten 2 Set Delay Merge PrimeTime脚本/Stage 2 Integration E2E Delay Merge Proc 规则.docx
@@ -32,7 +32,7 @@
         <w:br/>
         <w:t>3. 任一 immediate boundary、clock、port、cell、net、unknown、wildcard、变量、动态 selector、open_from/open_to 或 edge-specific option 都不得进入快路，必须执行既有 hydration、classification、merge 和 partial rewrite。</w:t>
         <w:br/>
-        <w:t>4. 新增 STAGE2_MAX_SEGMENT_PAIRS / -max_segment_pairs，默认 100000，必须是大于等于 1 的整数。非结构直通矩阵超过上限时禁止 materialize，原命令完整保留，并且只增加一条 MATRIX_EXPANSION_LIMIT review。</w:t>
+        <w:t>4. 新增 STAGE2_MAX_SEGMENT_PAIRS / -max_segment_pairs，默认 100000，必须是大于等于 1 的整数。非结构直通矩阵超过上限时禁止 materialize，原命令完整保留，并且只增加一条 MATRIX_EXPANSION_LIMIT review。Top port connectivity 映射后的 command-level pair 总数也必须再次判限，超限时禁止生成部分 boundary mapping。</w:t>
         <w:br/>
         <w:t>5. 新增 SEGMENT_PLAN、SEGMENT_EXPAND_BEGIN、SEGMENT_EXPAND_PROGRESS 和 SEGMENT_EXPAND_END，记录 source、file、line、from/to 数、product、action 和 elapsed_ms。progress 只对大矩阵有界输出。</w:t>
         <w:br/>
@@ -11359,20 +11359,6 @@
         <w:br/>
         <w:t>-max_segment_pairs &lt;N&gt;</w:t>
         <w:br/>
-        <w:t>-max_segment_pairs &lt;N&gt;</w:t>
-        <w:br/>
-        <w:t>-max_segment_pairs &lt;N&gt;</w:t>
-        <w:br/>
-        <w:t>-max_segment_pairs &lt;N&gt;</w:t>
-        <w:br/>
-        <w:t>-max_segment_pairs &lt;N&gt;</w:t>
-        <w:br/>
-        <w:t>-max_segment_pairs &lt;N&gt;</w:t>
-        <w:br/>
-        <w:t>-max_segment_pairs &lt;N&gt;</w:t>
-        <w:br/>
-        <w:t>-max_segment_pairs &lt;N&gt;</w:t>
-        <w:br/>
         <w:br/>
         <w:t>-check_units true</w:t>
         <w:br/>
@@ -11420,20 +11406,6 @@
         <w:t>-max_endpoints 1000</w:t>
         <w:br/>
         <w:t>-max_enum_objects 64</w:t>
-        <w:br/>
-        <w:t>-max_segment_pairs 100000</w:t>
-        <w:br/>
-        <w:t>-max_segment_pairs 100000</w:t>
-        <w:br/>
-        <w:t>-max_segment_pairs 100000</w:t>
-        <w:br/>
-        <w:t>-max_segment_pairs 100000</w:t>
-        <w:br/>
-        <w:t>-max_segment_pairs 100000</w:t>
-        <w:br/>
-        <w:t>-max_segment_pairs 100000</w:t>
-        <w:br/>
-        <w:t>-max_segment_pairs 100000</w:t>
         <w:br/>
         <w:t>-max_segment_pairs 100000</w:t>
         <w:br/>
@@ -13581,7 +13553,7 @@
     <w:p>
       <w:pPr/>
       <w:r>
-        <w:t>回归至少覆盖普通 clock、generated/master metadata、可选 attribute 不支持、稳定 clock 排序、模板全注释、最终 flatten SDC 不含新增 clock group，以及 GENERATE_CLOCK_GROUP_REVIEW=false 时不生成三个输出文件。复杂验证还必须覆盖 128-clock 大集合、clock 名含层级或 bus 下标、asynchronous/logically exclusive/physically exclusive 原始报告、PT redirect 捕获、0/1 clock 边界和关闭功能后的零 get_clocks/report_clock 查询。v0.9.10 扩展后当前 mock-Tcl 回归总数为 55。</w:t>
+        <w:t>回归至少覆盖普通 clock、generated/master metadata、可选 attribute 不支持、稳定 clock 排序、模板全注释、最终 flatten SDC 不含新增 clock group，以及 GENERATE_CLOCK_GROUP_REVIEW=false 时不生成三个输出文件。复杂验证还必须覆盖 128-clock 大集合、clock 名含层级或 bus 下标、asynchronous/logically exclusive/physically exclusive 原始报告、PT redirect 捕获、0/1 clock 边界和关闭功能后的零 get_clocks/report_clock 查询。v0.9.10 扩展后当前 mock-Tcl 回归总数为 57。</w:t>
       </w:r>
     </w:p>
     <w:p>
@@ -13771,7 +13743,7 @@
     <w:p>
       <w:pPr/>
       <w:r>
-        <w:t>max_segment_pairs 必须是大于等于 1 的整数。结构直通判定优先执行；其余 status=ok 且需要展开的 segment 按 effective_from_count x to_count 计算 product。只有 product &lt;= limit 才可 materialize。product &gt; limit 时设置 MATRIX_EXPANSION_LIMIT，保留原始命令、禁止 partial consume，并生成一条包含 from_count、to_count、pair_count 和 limit 的 review。不得静默截断到 limit，也不得只合并矩阵中的前 N 个 pair。</w:t>
+        <w:t>max_segment_pairs 必须是大于等于 1 的整数。结构直通判定优先执行；其余 status=ok 且需要展开的 segment 按 effective_from_count x to_count 计算 product。只有 product &lt;= limit 才可 materialize。product &gt; limit 时设置 MATRIX_EXPANSION_LIMIT，保留原始命令、禁止 partial consume，并生成一条包含 from_count、to_count、pair_count 和 limit 的 review。不得静默截断到 limit，也不得只合并矩阵中的前 N 个 pair。Top port endpoint 经 direct connectivity 映射后，必须按 original_id 汇总映射后的 command-level pair 总数并再次执行相同判限；超限时整条原约束进入一次 review，禁止生成部分 boundary mapping。</w:t>
       </w:r>
     </w:p>
     <w:p>

</xml_diff>